<commit_message>
Correct the document after the review: the photo status codes, the test and request counts, the money columns and the issue and PR counts
</commit_message>
<xml_diff>
--- a/docs/Ontwikkeldocument.docx
+++ b/docs/Ontwikkeldocument.docx
@@ -9839,7 +9839,7 @@
         <w:t xml:space="preserve">Geld als numeric, niet als double. </w:t>
       </w:r>
       <w:r>
-        <w:t xml:space="preserve">Tarieven en kosten staan als numeric(10,2), zodat er geen afrondingsfouten in de database komen.</w:t>
+        <w:t xml:space="preserve">Het tarief staat als numeric(8,2) en de kosten (aanschaf, verzekering, wegenbelasting, onderhoud) als numeric(10,2), zodat er geen afrondingsfouten in de database komen.</w:t>
       </w:r>
     </w:p>
     <w:p>
@@ -10347,7 +10347,7 @@
       <w:r>
         <w:drawing>
           <wp:inline distT="0" distB="0" distL="0" distR="0">
-            <wp:extent cx="3143250" cy="4314825"/>
+            <wp:extent cx="3143250" cy="4667250"/>
             <wp:effectExtent t="0" r="0" b="0" l="0"/>
             <wp:docPr id="4" name="/Users/roccobrand/Avans/rent-a-car/docs/diagrams/use-cases-core.png" descr="/Users/roccobrand/Avans/rent-a-car/docs/diagrams/use-cases-core.png" title="/Users/roccobrand/Avans/rent-a-car/docs/diagrams/use-cases-core.png"/>
             <wp:cNvGraphicFramePr>
@@ -10372,7 +10372,7 @@
                   <pic:spPr bwMode="auto">
                     <a:xfrm>
                       <a:off x="0" y="0"/>
-                      <a:ext cx="3143250" cy="4314825"/>
+                      <a:ext cx="3143250" cy="4667250"/>
                     </a:xfrm>
                     <a:prstGeom prst="rect">
                       <a:avLst/>
@@ -11613,7 +11613,7 @@
                 <w:sz w:val="18"/>
                 <w:szCs w:val="18"/>
               </w:rPr>
-              <w:t xml:space="preserve">Organisatie aanmaken en leden uitnodigen</w:t>
+              <w:t xml:space="preserve">Organisatie aanmaken</w:t>
             </w:r>
           </w:p>
         </w:tc>
@@ -11641,6 +11641,95 @@
                 <w:sz w:val="18"/>
                 <w:szCs w:val="18"/>
               </w:rPr>
+              <w:t xml:space="preserve">Eigenaar (elke ingelogde gebruiker mag dit)</w:t>
+            </w:r>
+          </w:p>
+        </w:tc>
+        <w:tc>
+          <w:tcPr>
+            <w:tcW w:type="dxa" w:w="5160"/>
+            <w:tcBorders>
+              <w:top w:val="single" w:color="999999" w:sz="4"/>
+              <w:left w:val="single" w:color="999999" w:sz="4"/>
+              <w:bottom w:val="single" w:color="999999" w:sz="4"/>
+              <w:right w:val="single" w:color="999999" w:sz="4"/>
+            </w:tcBorders>
+            <w:tcMar>
+              <w:top w:type="dxa" w:w="60"/>
+              <w:left w:type="dxa" w:w="100"/>
+              <w:bottom w:type="dxa" w:w="60"/>
+              <w:right w:type="dxa" w:w="100"/>
+            </w:tcMar>
+          </w:tcPr>
+          <w:p>
+            <w:r>
+              <w:rPr>
+                <w:b w:val="false"/>
+                <w:bCs w:val="false"/>
+                <w:sz w:val="18"/>
+                <w:szCs w:val="18"/>
+              </w:rPr>
+              <w:t xml:space="preserve">POST /organizations</w:t>
+            </w:r>
+          </w:p>
+        </w:tc>
+      </w:tr>
+      <w:tr>
+        <w:trPr>
+          <w:cantSplit/>
+        </w:trPr>
+        <w:tc>
+          <w:tcPr>
+            <w:tcW w:type="dxa" w:w="2700"/>
+            <w:tcBorders>
+              <w:top w:val="single" w:color="999999" w:sz="4"/>
+              <w:left w:val="single" w:color="999999" w:sz="4"/>
+              <w:bottom w:val="single" w:color="999999" w:sz="4"/>
+              <w:right w:val="single" w:color="999999" w:sz="4"/>
+            </w:tcBorders>
+            <w:tcMar>
+              <w:top w:type="dxa" w:w="60"/>
+              <w:left w:type="dxa" w:w="100"/>
+              <w:bottom w:type="dxa" w:w="60"/>
+              <w:right w:type="dxa" w:w="100"/>
+            </w:tcMar>
+          </w:tcPr>
+          <w:p>
+            <w:r>
+              <w:rPr>
+                <w:b w:val="false"/>
+                <w:bCs w:val="false"/>
+                <w:sz w:val="18"/>
+                <w:szCs w:val="18"/>
+              </w:rPr>
+              <w:t xml:space="preserve">Leden uitnodigen en rollen beheren</w:t>
+            </w:r>
+          </w:p>
+        </w:tc>
+        <w:tc>
+          <w:tcPr>
+            <w:tcW w:type="dxa" w:w="1500"/>
+            <w:tcBorders>
+              <w:top w:val="single" w:color="999999" w:sz="4"/>
+              <w:left w:val="single" w:color="999999" w:sz="4"/>
+              <w:bottom w:val="single" w:color="999999" w:sz="4"/>
+              <w:right w:val="single" w:color="999999" w:sz="4"/>
+            </w:tcBorders>
+            <w:tcMar>
+              <w:top w:type="dxa" w:w="60"/>
+              <w:left w:type="dxa" w:w="100"/>
+              <w:bottom w:type="dxa" w:w="60"/>
+              <w:right w:type="dxa" w:w="100"/>
+            </w:tcMar>
+          </w:tcPr>
+          <w:p>
+            <w:r>
+              <w:rPr>
+                <w:b w:val="false"/>
+                <w:bCs w:val="false"/>
+                <w:sz w:val="18"/>
+                <w:szCs w:val="18"/>
+              </w:rPr>
               <w:t xml:space="preserve">Organisatie-admin</w:t>
             </w:r>
           </w:p>
@@ -11669,7 +11758,96 @@
                 <w:sz w:val="18"/>
                 <w:szCs w:val="18"/>
               </w:rPr>
-              <w:t xml:space="preserve">POST /organizations, POST /organizations/{id}/invites, POST /invites/{code}/accept, PUT en DELETE /organizations/{id}/members/{userId}</w:t>
+              <w:t xml:space="preserve">POST /organizations/{id}/invites, PUT /organizations/{id}/members/{userId}</w:t>
+            </w:r>
+          </w:p>
+        </w:tc>
+      </w:tr>
+      <w:tr>
+        <w:trPr>
+          <w:cantSplit/>
+        </w:trPr>
+        <w:tc>
+          <w:tcPr>
+            <w:tcW w:type="dxa" w:w="2700"/>
+            <w:tcBorders>
+              <w:top w:val="single" w:color="999999" w:sz="4"/>
+              <w:left w:val="single" w:color="999999" w:sz="4"/>
+              <w:bottom w:val="single" w:color="999999" w:sz="4"/>
+              <w:right w:val="single" w:color="999999" w:sz="4"/>
+            </w:tcBorders>
+            <w:tcMar>
+              <w:top w:type="dxa" w:w="60"/>
+              <w:left w:type="dxa" w:w="100"/>
+              <w:bottom w:type="dxa" w:w="60"/>
+              <w:right w:type="dxa" w:w="100"/>
+            </w:tcMar>
+          </w:tcPr>
+          <w:p>
+            <w:r>
+              <w:rPr>
+                <w:b w:val="false"/>
+                <w:bCs w:val="false"/>
+                <w:sz w:val="18"/>
+                <w:szCs w:val="18"/>
+              </w:rPr>
+              <w:t xml:space="preserve">Uitnodiging accepteren, een lid verwijderen of zelf vertrekken</w:t>
+            </w:r>
+          </w:p>
+        </w:tc>
+        <w:tc>
+          <w:tcPr>
+            <w:tcW w:type="dxa" w:w="1500"/>
+            <w:tcBorders>
+              <w:top w:val="single" w:color="999999" w:sz="4"/>
+              <w:left w:val="single" w:color="999999" w:sz="4"/>
+              <w:bottom w:val="single" w:color="999999" w:sz="4"/>
+              <w:right w:val="single" w:color="999999" w:sz="4"/>
+            </w:tcBorders>
+            <w:tcMar>
+              <w:top w:type="dxa" w:w="60"/>
+              <w:left w:type="dxa" w:w="100"/>
+              <w:bottom w:type="dxa" w:w="60"/>
+              <w:right w:type="dxa" w:w="100"/>
+            </w:tcMar>
+          </w:tcPr>
+          <w:p>
+            <w:r>
+              <w:rPr>
+                <w:b w:val="false"/>
+                <w:bCs w:val="false"/>
+                <w:sz w:val="18"/>
+                <w:szCs w:val="18"/>
+              </w:rPr>
+              <w:t xml:space="preserve">Gebruiker, lid of admin</w:t>
+            </w:r>
+          </w:p>
+        </w:tc>
+        <w:tc>
+          <w:tcPr>
+            <w:tcW w:type="dxa" w:w="5160"/>
+            <w:tcBorders>
+              <w:top w:val="single" w:color="999999" w:sz="4"/>
+              <w:left w:val="single" w:color="999999" w:sz="4"/>
+              <w:bottom w:val="single" w:color="999999" w:sz="4"/>
+              <w:right w:val="single" w:color="999999" w:sz="4"/>
+            </w:tcBorders>
+            <w:tcMar>
+              <w:top w:type="dxa" w:w="60"/>
+              <w:left w:type="dxa" w:w="100"/>
+              <w:bottom w:type="dxa" w:w="60"/>
+              <w:right w:type="dxa" w:w="100"/>
+            </w:tcMar>
+          </w:tcPr>
+          <w:p>
+            <w:r>
+              <w:rPr>
+                <w:b w:val="false"/>
+                <w:bCs w:val="false"/>
+                <w:sz w:val="18"/>
+                <w:szCs w:val="18"/>
+              </w:rPr>
+              <w:t xml:space="preserve">POST /invites/{code}/accept, DELETE /organizations/{id}/members/{userId}</w:t>
             </w:r>
           </w:p>
         </w:tc>
@@ -11994,7 +12172,7 @@
         <w:spacing w:after="120"/>
       </w:pPr>
       <w:r>
-        <w:t xml:space="preserve">Vier sequence diagrams laten zien hoe de objecten in de applicatie samenwerken. Ze volgen de code stap voor stap, inclusief de foutgevallen. In docs/diagrams/ staat er een voor elk endpoint.</w:t>
+        <w:t xml:space="preserve">Vier sequence diagrams laten zien hoe de objecten in de applicatie samenwerken. Ze volgen de code stap voor stap, inclusief de foutgevallen. In docs/diagrams/ staan er 32, voor de meeste endpoints.</w:t>
       </w:r>
     </w:p>
     <w:p>
@@ -17183,7 +17361,7 @@
                 <w:sz w:val="18"/>
                 <w:szCs w:val="18"/>
               </w:rPr>
-              <w:t xml:space="preserve">De invoer is ongeldig: een onbekend filter, een negatief getal, een ontbrekend veld of een slechte limit of offset.</w:t>
+              <w:t xml:space="preserve">De invoer is ongeldig: een onbekend filter, een negatief getal, een ontbrekend veld, een foto die geen JPEG of PNG is, of een slechte limit of offset.</w:t>
             </w:r>
           </w:p>
         </w:tc>
@@ -17460,7 +17638,7 @@
                 <w:sz w:val="18"/>
                 <w:szCs w:val="18"/>
               </w:rPr>
-              <w:t xml:space="preserve">413 en 415</w:t>
+              <w:t xml:space="preserve">413</w:t>
             </w:r>
           </w:p>
         </w:tc>
@@ -17488,7 +17666,68 @@
                 <w:sz w:val="18"/>
                 <w:szCs w:val="18"/>
               </w:rPr>
-              <w:t xml:space="preserve">Een foto is te groot (maximaal 5 MB) of geen JPEG of PNG.</w:t>
+              <w:t xml:space="preserve">Een foto is groter dan 5 MB.</w:t>
+            </w:r>
+          </w:p>
+        </w:tc>
+      </w:tr>
+      <w:tr>
+        <w:trPr>
+          <w:cantSplit/>
+        </w:trPr>
+        <w:tc>
+          <w:tcPr>
+            <w:tcW w:type="dxa" w:w="900"/>
+            <w:tcBorders>
+              <w:top w:val="single" w:color="999999" w:sz="4"/>
+              <w:left w:val="single" w:color="999999" w:sz="4"/>
+              <w:bottom w:val="single" w:color="999999" w:sz="4"/>
+              <w:right w:val="single" w:color="999999" w:sz="4"/>
+            </w:tcBorders>
+            <w:tcMar>
+              <w:top w:type="dxa" w:w="60"/>
+              <w:left w:type="dxa" w:w="100"/>
+              <w:bottom w:type="dxa" w:w="60"/>
+              <w:right w:type="dxa" w:w="100"/>
+            </w:tcMar>
+          </w:tcPr>
+          <w:p>
+            <w:r>
+              <w:rPr>
+                <w:b w:val="false"/>
+                <w:bCs w:val="false"/>
+                <w:sz w:val="18"/>
+                <w:szCs w:val="18"/>
+              </w:rPr>
+              <w:t xml:space="preserve">415</w:t>
+            </w:r>
+          </w:p>
+        </w:tc>
+        <w:tc>
+          <w:tcPr>
+            <w:tcW w:type="dxa" w:w="8460"/>
+            <w:tcBorders>
+              <w:top w:val="single" w:color="999999" w:sz="4"/>
+              <w:left w:val="single" w:color="999999" w:sz="4"/>
+              <w:bottom w:val="single" w:color="999999" w:sz="4"/>
+              <w:right w:val="single" w:color="999999" w:sz="4"/>
+            </w:tcBorders>
+            <w:tcMar>
+              <w:top w:type="dxa" w:w="60"/>
+              <w:left w:type="dxa" w:w="100"/>
+              <w:bottom w:type="dxa" w:w="60"/>
+              <w:right w:type="dxa" w:w="100"/>
+            </w:tcMar>
+          </w:tcPr>
+          <w:p>
+            <w:r>
+              <w:rPr>
+                <w:b w:val="false"/>
+                <w:bCs w:val="false"/>
+                <w:sz w:val="18"/>
+                <w:szCs w:val="18"/>
+              </w:rPr>
+              <w:t xml:space="preserve">De body heeft een content type dat de server niet kan lezen, bijvoorbeeld geen JSON.</w:t>
             </w:r>
           </w:p>
         </w:tc>
@@ -17743,7 +17982,7 @@
         <w:spacing w:after="120"/>
       </w:pPr>
       <w:r>
-        <w:t xml:space="preserve">We hebben ./kotlin test op 25 oktober 2026 gedraaid: alle 506 tests slagen, er zijn er geen mislukt of overgeslagen. De server-module heeft 451 tests in 56 testklassen (ruim 90 seconden, vooral door het opstarten van Postgres); de console-client heeft 55 tests in 9 klassen.</w:t>
+        <w:t xml:space="preserve">We hebben ./kotlin test op 25 oktober 2026 gedraaid: alle 506 tests slagen, er zijn er geen mislukt of overgeslagen. De server-module heeft 451 tests in 52 testklassen (ruim 90 seconden, vooral door het opstarten van Postgres); de console-client heeft 55 tests in 6 klassen.</w:t>
       </w:r>
     </w:p>
     <w:tbl>
@@ -18429,7 +18668,7 @@
         <w:spacing w:after="120"/>
       </w:pPr>
       <w:r>
-        <w:t xml:space="preserve">De server-tests doen 170 requests: 61 POST, 58 GET, 32 DELETE en 19 PUT (het aantal aanroepen in de testcode, inclusief het klaarzetten van data). Voor auto’s is elk soort een eigen testklasse:</w:t>
+        <w:t xml:space="preserve">De server-tests doen requests van alle vier de soorten, ook om data klaar te zetten. Voor auto’s is elk soort een eigen testklasse:</w:t>
       </w:r>
     </w:p>
     <w:tbl>
@@ -21676,7 +21915,7 @@
         <w:t xml:space="preserve">Eerst een issue. </w:t>
       </w:r>
       <w:r>
-        <w:t xml:space="preserve">Elk stukje werk begint als issue met een user story, Scope, Out of scope, Depends on en Done when. Issues hebben een label voor de prioriteit (must-have of extra) en voor het gebied (accounts, cars, costs, reservations, trips, organizations, database), en horen bij een epic. Er zijn 64 issues, waarvan 8 epics.</w:t>
+        <w:t xml:space="preserve">Elk stukje werk begint als issue met een user story, Scope, Out of scope, Depends on en Done when. Issues hebben een label voor de prioriteit (must-have of extra) en voor het gebied (accounts, cars, costs, reservations, trips, organizations, database), en horen bij een epic. Er zijn 66 issues, waarvan 8 epics.</w:t>
       </w:r>
     </w:p>
     <w:p>
@@ -21716,7 +21955,7 @@
         <w:t xml:space="preserve">Een pull request per issue. </w:t>
       </w:r>
       <w:r>
-        <w:t xml:space="preserve">De titel begint met feat, fix, docs, test, ci of refactor en de beschrijving sluit het issue met “Closes #nummer”, zodat het issue vanzelf sluit. Er zijn 62 pull requests, waarvan 57 gemerged.</w:t>
+        <w:t xml:space="preserve">De titel begint met feat, fix, docs, test, ci of refactor en de beschrijving sluit het issue met “Closes #nummer”, zodat het issue vanzelf sluit. Er zijn 63 pull requests, waarvan 57 gemerged op het moment van schrijven.</w:t>
       </w:r>
     </w:p>
     <w:p>
@@ -21934,7 +22173,7 @@
                 <w:sz w:val="18"/>
                 <w:szCs w:val="18"/>
               </w:rPr>
-              <w:t xml:space="preserve">Pull requests geschreven (van 62)</w:t>
+              <w:t xml:space="preserve">Pull requests geschreven (van 63)</w:t>
             </w:r>
           </w:p>
         </w:tc>
@@ -21962,7 +22201,7 @@
                 <w:sz w:val="18"/>
                 <w:szCs w:val="18"/>
               </w:rPr>
-              <w:t xml:space="preserve">57</w:t>
+              <w:t xml:space="preserve">58</w:t>
             </w:r>
           </w:p>
         </w:tc>
@@ -22023,7 +22262,7 @@
                 <w:sz w:val="18"/>
                 <w:szCs w:val="18"/>
               </w:rPr>
-              <w:t xml:space="preserve">Issues toegewezen (van 64)</w:t>
+              <w:t xml:space="preserve">Issues toegewezen (van 66)</w:t>
             </w:r>
           </w:p>
         </w:tc>
@@ -22051,7 +22290,7 @@
                 <w:sz w:val="18"/>
                 <w:szCs w:val="18"/>
               </w:rPr>
-              <w:t xml:space="preserve">47</w:t>
+              <w:t xml:space="preserve">48</w:t>
             </w:r>
           </w:p>
         </w:tc>

</xml_diff>

<commit_message>
Remove the issue and pull request numbers from the development document
</commit_message>
<xml_diff>
--- a/docs/Ontwikkeldocument.docx
+++ b/docs/Ontwikkeldocument.docx
@@ -1654,8 +1654,7 @@
         </w:tblBorders>
       </w:tblPr>
       <w:tblGrid>
-        <w:gridCol w:w="800"/>
-        <w:gridCol w:w="7360"/>
+        <w:gridCol w:w="8160"/>
         <w:gridCol w:w="1200"/>
       </w:tblGrid>
       <w:tr>
@@ -1664,36 +1663,7 @@
         </w:trPr>
         <w:tc>
           <w:tcPr>
-            <w:tcW w:type="dxa" w:w="800"/>
-            <w:tcBorders>
-              <w:top w:val="single" w:color="999999" w:sz="4"/>
-              <w:left w:val="single" w:color="999999" w:sz="4"/>
-              <w:bottom w:val="single" w:color="999999" w:sz="4"/>
-              <w:right w:val="single" w:color="999999" w:sz="4"/>
-            </w:tcBorders>
-            <w:shd w:fill="D9E2F3" w:val="clear"/>
-            <w:tcMar>
-              <w:top w:type="dxa" w:w="60"/>
-              <w:left w:type="dxa" w:w="100"/>
-              <w:bottom w:type="dxa" w:w="60"/>
-              <w:right w:type="dxa" w:w="100"/>
-            </w:tcMar>
-          </w:tcPr>
-          <w:p>
-            <w:r>
-              <w:rPr>
-                <w:b/>
-                <w:bCs/>
-                <w:sz w:val="18"/>
-                <w:szCs w:val="18"/>
-              </w:rPr>
-              <w:t xml:space="preserve">Issue</w:t>
-            </w:r>
-          </w:p>
-        </w:tc>
-        <w:tc>
-          <w:tcPr>
-            <w:tcW w:type="dxa" w:w="7360"/>
+            <w:tcW w:type="dxa" w:w="8160"/>
             <w:tcBorders>
               <w:top w:val="single" w:color="999999" w:sz="4"/>
               <w:left w:val="single" w:color="999999" w:sz="4"/>
@@ -1756,35 +1726,7 @@
         </w:trPr>
         <w:tc>
           <w:tcPr>
-            <w:tcW w:type="dxa" w:w="800"/>
-            <w:tcBorders>
-              <w:top w:val="single" w:color="999999" w:sz="4"/>
-              <w:left w:val="single" w:color="999999" w:sz="4"/>
-              <w:bottom w:val="single" w:color="999999" w:sz="4"/>
-              <w:right w:val="single" w:color="999999" w:sz="4"/>
-            </w:tcBorders>
-            <w:tcMar>
-              <w:top w:type="dxa" w:w="60"/>
-              <w:left w:type="dxa" w:w="100"/>
-              <w:bottom w:type="dxa" w:w="60"/>
-              <w:right w:type="dxa" w:w="100"/>
-            </w:tcMar>
-          </w:tcPr>
-          <w:p>
-            <w:r>
-              <w:rPr>
-                <w:b w:val="false"/>
-                <w:bCs w:val="false"/>
-                <w:sz w:val="18"/>
-                <w:szCs w:val="18"/>
-              </w:rPr>
-              <w:t xml:space="preserve">#23</w:t>
-            </w:r>
-          </w:p>
-        </w:tc>
-        <w:tc>
-          <w:tcPr>
-            <w:tcW w:type="dxa" w:w="7360"/>
+            <w:tcW w:type="dxa" w:w="8160"/>
             <w:tcBorders>
               <w:top w:val="single" w:color="999999" w:sz="4"/>
               <w:left w:val="single" w:color="999999" w:sz="4"/>
@@ -1845,35 +1787,7 @@
         </w:trPr>
         <w:tc>
           <w:tcPr>
-            <w:tcW w:type="dxa" w:w="800"/>
-            <w:tcBorders>
-              <w:top w:val="single" w:color="999999" w:sz="4"/>
-              <w:left w:val="single" w:color="999999" w:sz="4"/>
-              <w:bottom w:val="single" w:color="999999" w:sz="4"/>
-              <w:right w:val="single" w:color="999999" w:sz="4"/>
-            </w:tcBorders>
-            <w:tcMar>
-              <w:top w:type="dxa" w:w="60"/>
-              <w:left w:type="dxa" w:w="100"/>
-              <w:bottom w:type="dxa" w:w="60"/>
-              <w:right w:type="dxa" w:w="100"/>
-            </w:tcMar>
-          </w:tcPr>
-          <w:p>
-            <w:r>
-              <w:rPr>
-                <w:b w:val="false"/>
-                <w:bCs w:val="false"/>
-                <w:sz w:val="18"/>
-                <w:szCs w:val="18"/>
-              </w:rPr>
-              <w:t xml:space="preserve">#24</w:t>
-            </w:r>
-          </w:p>
-        </w:tc>
-        <w:tc>
-          <w:tcPr>
-            <w:tcW w:type="dxa" w:w="7360"/>
+            <w:tcW w:type="dxa" w:w="8160"/>
             <w:tcBorders>
               <w:top w:val="single" w:color="999999" w:sz="4"/>
               <w:left w:val="single" w:color="999999" w:sz="4"/>
@@ -1934,35 +1848,7 @@
         </w:trPr>
         <w:tc>
           <w:tcPr>
-            <w:tcW w:type="dxa" w:w="800"/>
-            <w:tcBorders>
-              <w:top w:val="single" w:color="999999" w:sz="4"/>
-              <w:left w:val="single" w:color="999999" w:sz="4"/>
-              <w:bottom w:val="single" w:color="999999" w:sz="4"/>
-              <w:right w:val="single" w:color="999999" w:sz="4"/>
-            </w:tcBorders>
-            <w:tcMar>
-              <w:top w:type="dxa" w:w="60"/>
-              <w:left w:type="dxa" w:w="100"/>
-              <w:bottom w:type="dxa" w:w="60"/>
-              <w:right w:type="dxa" w:w="100"/>
-            </w:tcMar>
-          </w:tcPr>
-          <w:p>
-            <w:r>
-              <w:rPr>
-                <w:b w:val="false"/>
-                <w:bCs w:val="false"/>
-                <w:sz w:val="18"/>
-                <w:szCs w:val="18"/>
-              </w:rPr>
-              <w:t xml:space="preserve">#54</w:t>
-            </w:r>
-          </w:p>
-        </w:tc>
-        <w:tc>
-          <w:tcPr>
-            <w:tcW w:type="dxa" w:w="7360"/>
+            <w:tcW w:type="dxa" w:w="8160"/>
             <w:tcBorders>
               <w:top w:val="single" w:color="999999" w:sz="4"/>
               <w:left w:val="single" w:color="999999" w:sz="4"/>
@@ -2023,35 +1909,7 @@
         </w:trPr>
         <w:tc>
           <w:tcPr>
-            <w:tcW w:type="dxa" w:w="800"/>
-            <w:tcBorders>
-              <w:top w:val="single" w:color="999999" w:sz="4"/>
-              <w:left w:val="single" w:color="999999" w:sz="4"/>
-              <w:bottom w:val="single" w:color="999999" w:sz="4"/>
-              <w:right w:val="single" w:color="999999" w:sz="4"/>
-            </w:tcBorders>
-            <w:tcMar>
-              <w:top w:type="dxa" w:w="60"/>
-              <w:left w:type="dxa" w:w="100"/>
-              <w:bottom w:type="dxa" w:w="60"/>
-              <w:right w:type="dxa" w:w="100"/>
-            </w:tcMar>
-          </w:tcPr>
-          <w:p>
-            <w:r>
-              <w:rPr>
-                <w:b w:val="false"/>
-                <w:bCs w:val="false"/>
-                <w:sz w:val="18"/>
-                <w:szCs w:val="18"/>
-              </w:rPr>
-              <w:t xml:space="preserve">#25</w:t>
-            </w:r>
-          </w:p>
-        </w:tc>
-        <w:tc>
-          <w:tcPr>
-            <w:tcW w:type="dxa" w:w="7360"/>
+            <w:tcW w:type="dxa" w:w="8160"/>
             <w:tcBorders>
               <w:top w:val="single" w:color="999999" w:sz="4"/>
               <w:left w:val="single" w:color="999999" w:sz="4"/>
@@ -2112,35 +1970,7 @@
         </w:trPr>
         <w:tc>
           <w:tcPr>
-            <w:tcW w:type="dxa" w:w="800"/>
-            <w:tcBorders>
-              <w:top w:val="single" w:color="999999" w:sz="4"/>
-              <w:left w:val="single" w:color="999999" w:sz="4"/>
-              <w:bottom w:val="single" w:color="999999" w:sz="4"/>
-              <w:right w:val="single" w:color="999999" w:sz="4"/>
-            </w:tcBorders>
-            <w:tcMar>
-              <w:top w:type="dxa" w:w="60"/>
-              <w:left w:type="dxa" w:w="100"/>
-              <w:bottom w:type="dxa" w:w="60"/>
-              <w:right w:type="dxa" w:w="100"/>
-            </w:tcMar>
-          </w:tcPr>
-          <w:p>
-            <w:r>
-              <w:rPr>
-                <w:b w:val="false"/>
-                <w:bCs w:val="false"/>
-                <w:sz w:val="18"/>
-                <w:szCs w:val="18"/>
-              </w:rPr>
-              <w:t xml:space="preserve">#30</w:t>
-            </w:r>
-          </w:p>
-        </w:tc>
-        <w:tc>
-          <w:tcPr>
-            <w:tcW w:type="dxa" w:w="7360"/>
+            <w:tcW w:type="dxa" w:w="8160"/>
             <w:tcBorders>
               <w:top w:val="single" w:color="999999" w:sz="4"/>
               <w:left w:val="single" w:color="999999" w:sz="4"/>
@@ -2201,35 +2031,7 @@
         </w:trPr>
         <w:tc>
           <w:tcPr>
-            <w:tcW w:type="dxa" w:w="800"/>
-            <w:tcBorders>
-              <w:top w:val="single" w:color="999999" w:sz="4"/>
-              <w:left w:val="single" w:color="999999" w:sz="4"/>
-              <w:bottom w:val="single" w:color="999999" w:sz="4"/>
-              <w:right w:val="single" w:color="999999" w:sz="4"/>
-            </w:tcBorders>
-            <w:tcMar>
-              <w:top w:type="dxa" w:w="60"/>
-              <w:left w:type="dxa" w:w="100"/>
-              <w:bottom w:type="dxa" w:w="60"/>
-              <w:right w:type="dxa" w:w="100"/>
-            </w:tcMar>
-          </w:tcPr>
-          <w:p>
-            <w:r>
-              <w:rPr>
-                <w:b w:val="false"/>
-                <w:bCs w:val="false"/>
-                <w:sz w:val="18"/>
-                <w:szCs w:val="18"/>
-              </w:rPr>
-              <w:t xml:space="preserve">#57</w:t>
-            </w:r>
-          </w:p>
-        </w:tc>
-        <w:tc>
-          <w:tcPr>
-            <w:tcW w:type="dxa" w:w="7360"/>
+            <w:tcW w:type="dxa" w:w="8160"/>
             <w:tcBorders>
               <w:top w:val="single" w:color="999999" w:sz="4"/>
               <w:left w:val="single" w:color="999999" w:sz="4"/>
@@ -2290,35 +2092,7 @@
         </w:trPr>
         <w:tc>
           <w:tcPr>
-            <w:tcW w:type="dxa" w:w="800"/>
-            <w:tcBorders>
-              <w:top w:val="single" w:color="999999" w:sz="4"/>
-              <w:left w:val="single" w:color="999999" w:sz="4"/>
-              <w:bottom w:val="single" w:color="999999" w:sz="4"/>
-              <w:right w:val="single" w:color="999999" w:sz="4"/>
-            </w:tcBorders>
-            <w:tcMar>
-              <w:top w:type="dxa" w:w="60"/>
-              <w:left w:type="dxa" w:w="100"/>
-              <w:bottom w:type="dxa" w:w="60"/>
-              <w:right w:type="dxa" w:w="100"/>
-            </w:tcMar>
-          </w:tcPr>
-          <w:p>
-            <w:r>
-              <w:rPr>
-                <w:b w:val="false"/>
-                <w:bCs w:val="false"/>
-                <w:sz w:val="18"/>
-                <w:szCs w:val="18"/>
-              </w:rPr>
-              <w:t xml:space="preserve">#58</w:t>
-            </w:r>
-          </w:p>
-        </w:tc>
-        <w:tc>
-          <w:tcPr>
-            <w:tcW w:type="dxa" w:w="7360"/>
+            <w:tcW w:type="dxa" w:w="8160"/>
             <w:tcBorders>
               <w:top w:val="single" w:color="999999" w:sz="4"/>
               <w:left w:val="single" w:color="999999" w:sz="4"/>
@@ -2379,35 +2153,7 @@
         </w:trPr>
         <w:tc>
           <w:tcPr>
-            <w:tcW w:type="dxa" w:w="800"/>
-            <w:tcBorders>
-              <w:top w:val="single" w:color="999999" w:sz="4"/>
-              <w:left w:val="single" w:color="999999" w:sz="4"/>
-              <w:bottom w:val="single" w:color="999999" w:sz="4"/>
-              <w:right w:val="single" w:color="999999" w:sz="4"/>
-            </w:tcBorders>
-            <w:tcMar>
-              <w:top w:type="dxa" w:w="60"/>
-              <w:left w:type="dxa" w:w="100"/>
-              <w:bottom w:type="dxa" w:w="60"/>
-              <w:right w:type="dxa" w:w="100"/>
-            </w:tcMar>
-          </w:tcPr>
-          <w:p>
-            <w:r>
-              <w:rPr>
-                <w:b w:val="false"/>
-                <w:bCs w:val="false"/>
-                <w:sz w:val="18"/>
-                <w:szCs w:val="18"/>
-              </w:rPr>
-              <w:t xml:space="preserve">#59</w:t>
-            </w:r>
-          </w:p>
-        </w:tc>
-        <w:tc>
-          <w:tcPr>
-            <w:tcW w:type="dxa" w:w="7360"/>
+            <w:tcW w:type="dxa" w:w="8160"/>
             <w:tcBorders>
               <w:top w:val="single" w:color="999999" w:sz="4"/>
               <w:left w:val="single" w:color="999999" w:sz="4"/>
@@ -2468,35 +2214,7 @@
         </w:trPr>
         <w:tc>
           <w:tcPr>
-            <w:tcW w:type="dxa" w:w="800"/>
-            <w:tcBorders>
-              <w:top w:val="single" w:color="999999" w:sz="4"/>
-              <w:left w:val="single" w:color="999999" w:sz="4"/>
-              <w:bottom w:val="single" w:color="999999" w:sz="4"/>
-              <w:right w:val="single" w:color="999999" w:sz="4"/>
-            </w:tcBorders>
-            <w:tcMar>
-              <w:top w:type="dxa" w:w="60"/>
-              <w:left w:type="dxa" w:w="100"/>
-              <w:bottom w:type="dxa" w:w="60"/>
-              <w:right w:type="dxa" w:w="100"/>
-            </w:tcMar>
-          </w:tcPr>
-          <w:p>
-            <w:r>
-              <w:rPr>
-                <w:b w:val="false"/>
-                <w:bCs w:val="false"/>
-                <w:sz w:val="18"/>
-                <w:szCs w:val="18"/>
-              </w:rPr>
-              <w:t xml:space="preserve">#63</w:t>
-            </w:r>
-          </w:p>
-        </w:tc>
-        <w:tc>
-          <w:tcPr>
-            <w:tcW w:type="dxa" w:w="7360"/>
+            <w:tcW w:type="dxa" w:w="8160"/>
             <w:tcBorders>
               <w:top w:val="single" w:color="999999" w:sz="4"/>
               <w:left w:val="single" w:color="999999" w:sz="4"/>
@@ -2557,35 +2275,7 @@
         </w:trPr>
         <w:tc>
           <w:tcPr>
-            <w:tcW w:type="dxa" w:w="800"/>
-            <w:tcBorders>
-              <w:top w:val="single" w:color="999999" w:sz="4"/>
-              <w:left w:val="single" w:color="999999" w:sz="4"/>
-              <w:bottom w:val="single" w:color="999999" w:sz="4"/>
-              <w:right w:val="single" w:color="999999" w:sz="4"/>
-            </w:tcBorders>
-            <w:tcMar>
-              <w:top w:type="dxa" w:w="60"/>
-              <w:left w:type="dxa" w:w="100"/>
-              <w:bottom w:type="dxa" w:w="60"/>
-              <w:right w:type="dxa" w:w="100"/>
-            </w:tcMar>
-          </w:tcPr>
-          <w:p>
-            <w:r>
-              <w:rPr>
-                <w:b w:val="false"/>
-                <w:bCs w:val="false"/>
-                <w:sz w:val="18"/>
-                <w:szCs w:val="18"/>
-              </w:rPr>
-              <w:t xml:space="preserve">#89</w:t>
-            </w:r>
-          </w:p>
-        </w:tc>
-        <w:tc>
-          <w:tcPr>
-            <w:tcW w:type="dxa" w:w="7360"/>
+            <w:tcW w:type="dxa" w:w="8160"/>
             <w:tcBorders>
               <w:top w:val="single" w:color="999999" w:sz="4"/>
               <w:left w:val="single" w:color="999999" w:sz="4"/>
@@ -2646,35 +2336,7 @@
         </w:trPr>
         <w:tc>
           <w:tcPr>
-            <w:tcW w:type="dxa" w:w="800"/>
-            <w:tcBorders>
-              <w:top w:val="single" w:color="999999" w:sz="4"/>
-              <w:left w:val="single" w:color="999999" w:sz="4"/>
-              <w:bottom w:val="single" w:color="999999" w:sz="4"/>
-              <w:right w:val="single" w:color="999999" w:sz="4"/>
-            </w:tcBorders>
-            <w:tcMar>
-              <w:top w:type="dxa" w:w="60"/>
-              <w:left w:type="dxa" w:w="100"/>
-              <w:bottom w:type="dxa" w:w="60"/>
-              <w:right w:type="dxa" w:w="100"/>
-            </w:tcMar>
-          </w:tcPr>
-          <w:p>
-            <w:r>
-              <w:rPr>
-                <w:b w:val="false"/>
-                <w:bCs w:val="false"/>
-                <w:sz w:val="18"/>
-                <w:szCs w:val="18"/>
-              </w:rPr>
-              <w:t xml:space="preserve">#90</w:t>
-            </w:r>
-          </w:p>
-        </w:tc>
-        <w:tc>
-          <w:tcPr>
-            <w:tcW w:type="dxa" w:w="7360"/>
+            <w:tcW w:type="dxa" w:w="8160"/>
             <w:tcBorders>
               <w:top w:val="single" w:color="999999" w:sz="4"/>
               <w:left w:val="single" w:color="999999" w:sz="4"/>
@@ -2756,8 +2418,7 @@
         </w:tblBorders>
       </w:tblPr>
       <w:tblGrid>
-        <w:gridCol w:w="800"/>
-        <w:gridCol w:w="7360"/>
+        <w:gridCol w:w="8160"/>
         <w:gridCol w:w="1200"/>
       </w:tblGrid>
       <w:tr>
@@ -2766,36 +2427,7 @@
         </w:trPr>
         <w:tc>
           <w:tcPr>
-            <w:tcW w:type="dxa" w:w="800"/>
-            <w:tcBorders>
-              <w:top w:val="single" w:color="999999" w:sz="4"/>
-              <w:left w:val="single" w:color="999999" w:sz="4"/>
-              <w:bottom w:val="single" w:color="999999" w:sz="4"/>
-              <w:right w:val="single" w:color="999999" w:sz="4"/>
-            </w:tcBorders>
-            <w:shd w:fill="D9E2F3" w:val="clear"/>
-            <w:tcMar>
-              <w:top w:type="dxa" w:w="60"/>
-              <w:left w:type="dxa" w:w="100"/>
-              <w:bottom w:type="dxa" w:w="60"/>
-              <w:right w:type="dxa" w:w="100"/>
-            </w:tcMar>
-          </w:tcPr>
-          <w:p>
-            <w:r>
-              <w:rPr>
-                <w:b/>
-                <w:bCs/>
-                <w:sz w:val="18"/>
-                <w:szCs w:val="18"/>
-              </w:rPr>
-              <w:t xml:space="preserve">Issue</w:t>
-            </w:r>
-          </w:p>
-        </w:tc>
-        <w:tc>
-          <w:tcPr>
-            <w:tcW w:type="dxa" w:w="7360"/>
+            <w:tcW w:type="dxa" w:w="8160"/>
             <w:tcBorders>
               <w:top w:val="single" w:color="999999" w:sz="4"/>
               <w:left w:val="single" w:color="999999" w:sz="4"/>
@@ -2858,35 +2490,7 @@
         </w:trPr>
         <w:tc>
           <w:tcPr>
-            <w:tcW w:type="dxa" w:w="800"/>
-            <w:tcBorders>
-              <w:top w:val="single" w:color="999999" w:sz="4"/>
-              <w:left w:val="single" w:color="999999" w:sz="4"/>
-              <w:bottom w:val="single" w:color="999999" w:sz="4"/>
-              <w:right w:val="single" w:color="999999" w:sz="4"/>
-            </w:tcBorders>
-            <w:tcMar>
-              <w:top w:type="dxa" w:w="60"/>
-              <w:left w:type="dxa" w:w="100"/>
-              <w:bottom w:type="dxa" w:w="60"/>
-              <w:right w:type="dxa" w:w="100"/>
-            </w:tcMar>
-          </w:tcPr>
-          <w:p>
-            <w:r>
-              <w:rPr>
-                <w:b w:val="false"/>
-                <w:bCs w:val="false"/>
-                <w:sz w:val="18"/>
-                <w:szCs w:val="18"/>
-              </w:rPr>
-              <w:t xml:space="preserve">#6</w:t>
-            </w:r>
-          </w:p>
-        </w:tc>
-        <w:tc>
-          <w:tcPr>
-            <w:tcW w:type="dxa" w:w="7360"/>
+            <w:tcW w:type="dxa" w:w="8160"/>
             <w:tcBorders>
               <w:top w:val="single" w:color="999999" w:sz="4"/>
               <w:left w:val="single" w:color="999999" w:sz="4"/>
@@ -2947,35 +2551,7 @@
         </w:trPr>
         <w:tc>
           <w:tcPr>
-            <w:tcW w:type="dxa" w:w="800"/>
-            <w:tcBorders>
-              <w:top w:val="single" w:color="999999" w:sz="4"/>
-              <w:left w:val="single" w:color="999999" w:sz="4"/>
-              <w:bottom w:val="single" w:color="999999" w:sz="4"/>
-              <w:right w:val="single" w:color="999999" w:sz="4"/>
-            </w:tcBorders>
-            <w:tcMar>
-              <w:top w:type="dxa" w:w="60"/>
-              <w:left w:type="dxa" w:w="100"/>
-              <w:bottom w:type="dxa" w:w="60"/>
-              <w:right w:type="dxa" w:w="100"/>
-            </w:tcMar>
-          </w:tcPr>
-          <w:p>
-            <w:r>
-              <w:rPr>
-                <w:b w:val="false"/>
-                <w:bCs w:val="false"/>
-                <w:sz w:val="18"/>
-                <w:szCs w:val="18"/>
-              </w:rPr>
-              <w:t xml:space="preserve">#8</w:t>
-            </w:r>
-          </w:p>
-        </w:tc>
-        <w:tc>
-          <w:tcPr>
-            <w:tcW w:type="dxa" w:w="7360"/>
+            <w:tcW w:type="dxa" w:w="8160"/>
             <w:tcBorders>
               <w:top w:val="single" w:color="999999" w:sz="4"/>
               <w:left w:val="single" w:color="999999" w:sz="4"/>
@@ -3036,35 +2612,7 @@
         </w:trPr>
         <w:tc>
           <w:tcPr>
-            <w:tcW w:type="dxa" w:w="800"/>
-            <w:tcBorders>
-              <w:top w:val="single" w:color="999999" w:sz="4"/>
-              <w:left w:val="single" w:color="999999" w:sz="4"/>
-              <w:bottom w:val="single" w:color="999999" w:sz="4"/>
-              <w:right w:val="single" w:color="999999" w:sz="4"/>
-            </w:tcBorders>
-            <w:tcMar>
-              <w:top w:type="dxa" w:w="60"/>
-              <w:left w:type="dxa" w:w="100"/>
-              <w:bottom w:type="dxa" w:w="60"/>
-              <w:right w:type="dxa" w:w="100"/>
-            </w:tcMar>
-          </w:tcPr>
-          <w:p>
-            <w:r>
-              <w:rPr>
-                <w:b w:val="false"/>
-                <w:bCs w:val="false"/>
-                <w:sz w:val="18"/>
-                <w:szCs w:val="18"/>
-              </w:rPr>
-              <w:t xml:space="preserve">#9</w:t>
-            </w:r>
-          </w:p>
-        </w:tc>
-        <w:tc>
-          <w:tcPr>
-            <w:tcW w:type="dxa" w:w="7360"/>
+            <w:tcW w:type="dxa" w:w="8160"/>
             <w:tcBorders>
               <w:top w:val="single" w:color="999999" w:sz="4"/>
               <w:left w:val="single" w:color="999999" w:sz="4"/>
@@ -3125,35 +2673,7 @@
         </w:trPr>
         <w:tc>
           <w:tcPr>
-            <w:tcW w:type="dxa" w:w="800"/>
-            <w:tcBorders>
-              <w:top w:val="single" w:color="999999" w:sz="4"/>
-              <w:left w:val="single" w:color="999999" w:sz="4"/>
-              <w:bottom w:val="single" w:color="999999" w:sz="4"/>
-              <w:right w:val="single" w:color="999999" w:sz="4"/>
-            </w:tcBorders>
-            <w:tcMar>
-              <w:top w:type="dxa" w:w="60"/>
-              <w:left w:type="dxa" w:w="100"/>
-              <w:bottom w:type="dxa" w:w="60"/>
-              <w:right w:type="dxa" w:w="100"/>
-            </w:tcMar>
-          </w:tcPr>
-          <w:p>
-            <w:r>
-              <w:rPr>
-                <w:b w:val="false"/>
-                <w:bCs w:val="false"/>
-                <w:sz w:val="18"/>
-                <w:szCs w:val="18"/>
-              </w:rPr>
-              <w:t xml:space="preserve">#12</w:t>
-            </w:r>
-          </w:p>
-        </w:tc>
-        <w:tc>
-          <w:tcPr>
-            <w:tcW w:type="dxa" w:w="7360"/>
+            <w:tcW w:type="dxa" w:w="8160"/>
             <w:tcBorders>
               <w:top w:val="single" w:color="999999" w:sz="4"/>
               <w:left w:val="single" w:color="999999" w:sz="4"/>
@@ -3214,35 +2734,7 @@
         </w:trPr>
         <w:tc>
           <w:tcPr>
-            <w:tcW w:type="dxa" w:w="800"/>
-            <w:tcBorders>
-              <w:top w:val="single" w:color="999999" w:sz="4"/>
-              <w:left w:val="single" w:color="999999" w:sz="4"/>
-              <w:bottom w:val="single" w:color="999999" w:sz="4"/>
-              <w:right w:val="single" w:color="999999" w:sz="4"/>
-            </w:tcBorders>
-            <w:tcMar>
-              <w:top w:type="dxa" w:w="60"/>
-              <w:left w:type="dxa" w:w="100"/>
-              <w:bottom w:type="dxa" w:w="60"/>
-              <w:right w:type="dxa" w:w="100"/>
-            </w:tcMar>
-          </w:tcPr>
-          <w:p>
-            <w:r>
-              <w:rPr>
-                <w:b w:val="false"/>
-                <w:bCs w:val="false"/>
-                <w:sz w:val="18"/>
-                <w:szCs w:val="18"/>
-              </w:rPr>
-              <w:t xml:space="preserve">#13</w:t>
-            </w:r>
-          </w:p>
-        </w:tc>
-        <w:tc>
-          <w:tcPr>
-            <w:tcW w:type="dxa" w:w="7360"/>
+            <w:tcW w:type="dxa" w:w="8160"/>
             <w:tcBorders>
               <w:top w:val="single" w:color="999999" w:sz="4"/>
               <w:left w:val="single" w:color="999999" w:sz="4"/>
@@ -3303,35 +2795,7 @@
         </w:trPr>
         <w:tc>
           <w:tcPr>
-            <w:tcW w:type="dxa" w:w="800"/>
-            <w:tcBorders>
-              <w:top w:val="single" w:color="999999" w:sz="4"/>
-              <w:left w:val="single" w:color="999999" w:sz="4"/>
-              <w:bottom w:val="single" w:color="999999" w:sz="4"/>
-              <w:right w:val="single" w:color="999999" w:sz="4"/>
-            </w:tcBorders>
-            <w:tcMar>
-              <w:top w:type="dxa" w:w="60"/>
-              <w:left w:type="dxa" w:w="100"/>
-              <w:bottom w:type="dxa" w:w="60"/>
-              <w:right w:type="dxa" w:w="100"/>
-            </w:tcMar>
-          </w:tcPr>
-          <w:p>
-            <w:r>
-              <w:rPr>
-                <w:b w:val="false"/>
-                <w:bCs w:val="false"/>
-                <w:sz w:val="18"/>
-                <w:szCs w:val="18"/>
-              </w:rPr>
-              <w:t xml:space="preserve">#14</w:t>
-            </w:r>
-          </w:p>
-        </w:tc>
-        <w:tc>
-          <w:tcPr>
-            <w:tcW w:type="dxa" w:w="7360"/>
+            <w:tcW w:type="dxa" w:w="8160"/>
             <w:tcBorders>
               <w:top w:val="single" w:color="999999" w:sz="4"/>
               <w:left w:val="single" w:color="999999" w:sz="4"/>
@@ -3392,35 +2856,7 @@
         </w:trPr>
         <w:tc>
           <w:tcPr>
-            <w:tcW w:type="dxa" w:w="800"/>
-            <w:tcBorders>
-              <w:top w:val="single" w:color="999999" w:sz="4"/>
-              <w:left w:val="single" w:color="999999" w:sz="4"/>
-              <w:bottom w:val="single" w:color="999999" w:sz="4"/>
-              <w:right w:val="single" w:color="999999" w:sz="4"/>
-            </w:tcBorders>
-            <w:tcMar>
-              <w:top w:type="dxa" w:w="60"/>
-              <w:left w:type="dxa" w:w="100"/>
-              <w:bottom w:type="dxa" w:w="60"/>
-              <w:right w:type="dxa" w:w="100"/>
-            </w:tcMar>
-          </w:tcPr>
-          <w:p>
-            <w:r>
-              <w:rPr>
-                <w:b w:val="false"/>
-                <w:bCs w:val="false"/>
-                <w:sz w:val="18"/>
-                <w:szCs w:val="18"/>
-              </w:rPr>
-              <w:t xml:space="preserve">#32</w:t>
-            </w:r>
-          </w:p>
-        </w:tc>
-        <w:tc>
-          <w:tcPr>
-            <w:tcW w:type="dxa" w:w="7360"/>
+            <w:tcW w:type="dxa" w:w="8160"/>
             <w:tcBorders>
               <w:top w:val="single" w:color="999999" w:sz="4"/>
               <w:left w:val="single" w:color="999999" w:sz="4"/>
@@ -3481,35 +2917,7 @@
         </w:trPr>
         <w:tc>
           <w:tcPr>
-            <w:tcW w:type="dxa" w:w="800"/>
-            <w:tcBorders>
-              <w:top w:val="single" w:color="999999" w:sz="4"/>
-              <w:left w:val="single" w:color="999999" w:sz="4"/>
-              <w:bottom w:val="single" w:color="999999" w:sz="4"/>
-              <w:right w:val="single" w:color="999999" w:sz="4"/>
-            </w:tcBorders>
-            <w:tcMar>
-              <w:top w:type="dxa" w:w="60"/>
-              <w:left w:type="dxa" w:w="100"/>
-              <w:bottom w:type="dxa" w:w="60"/>
-              <w:right w:type="dxa" w:w="100"/>
-            </w:tcMar>
-          </w:tcPr>
-          <w:p>
-            <w:r>
-              <w:rPr>
-                <w:b w:val="false"/>
-                <w:bCs w:val="false"/>
-                <w:sz w:val="18"/>
-                <w:szCs w:val="18"/>
-              </w:rPr>
-              <w:t xml:space="preserve">#38</w:t>
-            </w:r>
-          </w:p>
-        </w:tc>
-        <w:tc>
-          <w:tcPr>
-            <w:tcW w:type="dxa" w:w="7360"/>
+            <w:tcW w:type="dxa" w:w="8160"/>
             <w:tcBorders>
               <w:top w:val="single" w:color="999999" w:sz="4"/>
               <w:left w:val="single" w:color="999999" w:sz="4"/>
@@ -3570,35 +2978,7 @@
         </w:trPr>
         <w:tc>
           <w:tcPr>
-            <w:tcW w:type="dxa" w:w="800"/>
-            <w:tcBorders>
-              <w:top w:val="single" w:color="999999" w:sz="4"/>
-              <w:left w:val="single" w:color="999999" w:sz="4"/>
-              <w:bottom w:val="single" w:color="999999" w:sz="4"/>
-              <w:right w:val="single" w:color="999999" w:sz="4"/>
-            </w:tcBorders>
-            <w:tcMar>
-              <w:top w:type="dxa" w:w="60"/>
-              <w:left w:type="dxa" w:w="100"/>
-              <w:bottom w:type="dxa" w:w="60"/>
-              <w:right w:type="dxa" w:w="100"/>
-            </w:tcMar>
-          </w:tcPr>
-          <w:p>
-            <w:r>
-              <w:rPr>
-                <w:b w:val="false"/>
-                <w:bCs w:val="false"/>
-                <w:sz w:val="18"/>
-                <w:szCs w:val="18"/>
-              </w:rPr>
-              <w:t xml:space="preserve">#92</w:t>
-            </w:r>
-          </w:p>
-        </w:tc>
-        <w:tc>
-          <w:tcPr>
-            <w:tcW w:type="dxa" w:w="7360"/>
+            <w:tcW w:type="dxa" w:w="8160"/>
             <w:tcBorders>
               <w:top w:val="single" w:color="999999" w:sz="4"/>
               <w:left w:val="single" w:color="999999" w:sz="4"/>
@@ -3659,35 +3039,7 @@
         </w:trPr>
         <w:tc>
           <w:tcPr>
-            <w:tcW w:type="dxa" w:w="800"/>
-            <w:tcBorders>
-              <w:top w:val="single" w:color="999999" w:sz="4"/>
-              <w:left w:val="single" w:color="999999" w:sz="4"/>
-              <w:bottom w:val="single" w:color="999999" w:sz="4"/>
-              <w:right w:val="single" w:color="999999" w:sz="4"/>
-            </w:tcBorders>
-            <w:tcMar>
-              <w:top w:type="dxa" w:w="60"/>
-              <w:left w:type="dxa" w:w="100"/>
-              <w:bottom w:type="dxa" w:w="60"/>
-              <w:right w:type="dxa" w:w="100"/>
-            </w:tcMar>
-          </w:tcPr>
-          <w:p>
-            <w:r>
-              <w:rPr>
-                <w:b w:val="false"/>
-                <w:bCs w:val="false"/>
-                <w:sz w:val="18"/>
-                <w:szCs w:val="18"/>
-              </w:rPr>
-              <w:t xml:space="preserve">#97</w:t>
-            </w:r>
-          </w:p>
-        </w:tc>
-        <w:tc>
-          <w:tcPr>
-            <w:tcW w:type="dxa" w:w="7360"/>
+            <w:tcW w:type="dxa" w:w="8160"/>
             <w:tcBorders>
               <w:top w:val="single" w:color="999999" w:sz="4"/>
               <w:left w:val="single" w:color="999999" w:sz="4"/>
@@ -3748,35 +3100,7 @@
         </w:trPr>
         <w:tc>
           <w:tcPr>
-            <w:tcW w:type="dxa" w:w="800"/>
-            <w:tcBorders>
-              <w:top w:val="single" w:color="999999" w:sz="4"/>
-              <w:left w:val="single" w:color="999999" w:sz="4"/>
-              <w:bottom w:val="single" w:color="999999" w:sz="4"/>
-              <w:right w:val="single" w:color="999999" w:sz="4"/>
-            </w:tcBorders>
-            <w:tcMar>
-              <w:top w:type="dxa" w:w="60"/>
-              <w:left w:type="dxa" w:w="100"/>
-              <w:bottom w:type="dxa" w:w="60"/>
-              <w:right w:type="dxa" w:w="100"/>
-            </w:tcMar>
-          </w:tcPr>
-          <w:p>
-            <w:r>
-              <w:rPr>
-                <w:b w:val="false"/>
-                <w:bCs w:val="false"/>
-                <w:sz w:val="18"/>
-                <w:szCs w:val="18"/>
-              </w:rPr>
-              <w:t xml:space="preserve">#98</w:t>
-            </w:r>
-          </w:p>
-        </w:tc>
-        <w:tc>
-          <w:tcPr>
-            <w:tcW w:type="dxa" w:w="7360"/>
+            <w:tcW w:type="dxa" w:w="8160"/>
             <w:tcBorders>
               <w:top w:val="single" w:color="999999" w:sz="4"/>
               <w:left w:val="single" w:color="999999" w:sz="4"/>
@@ -3858,8 +3182,7 @@
         </w:tblBorders>
       </w:tblPr>
       <w:tblGrid>
-        <w:gridCol w:w="800"/>
-        <w:gridCol w:w="7360"/>
+        <w:gridCol w:w="8160"/>
         <w:gridCol w:w="1200"/>
       </w:tblGrid>
       <w:tr>
@@ -3868,36 +3191,7 @@
         </w:trPr>
         <w:tc>
           <w:tcPr>
-            <w:tcW w:type="dxa" w:w="800"/>
-            <w:tcBorders>
-              <w:top w:val="single" w:color="999999" w:sz="4"/>
-              <w:left w:val="single" w:color="999999" w:sz="4"/>
-              <w:bottom w:val="single" w:color="999999" w:sz="4"/>
-              <w:right w:val="single" w:color="999999" w:sz="4"/>
-            </w:tcBorders>
-            <w:shd w:fill="D9E2F3" w:val="clear"/>
-            <w:tcMar>
-              <w:top w:type="dxa" w:w="60"/>
-              <w:left w:type="dxa" w:w="100"/>
-              <w:bottom w:type="dxa" w:w="60"/>
-              <w:right w:type="dxa" w:w="100"/>
-            </w:tcMar>
-          </w:tcPr>
-          <w:p>
-            <w:r>
-              <w:rPr>
-                <w:b/>
-                <w:bCs/>
-                <w:sz w:val="18"/>
-                <w:szCs w:val="18"/>
-              </w:rPr>
-              <w:t xml:space="preserve">Issue</w:t>
-            </w:r>
-          </w:p>
-        </w:tc>
-        <w:tc>
-          <w:tcPr>
-            <w:tcW w:type="dxa" w:w="7360"/>
+            <w:tcW w:type="dxa" w:w="8160"/>
             <w:tcBorders>
               <w:top w:val="single" w:color="999999" w:sz="4"/>
               <w:left w:val="single" w:color="999999" w:sz="4"/>
@@ -3960,35 +3254,7 @@
         </w:trPr>
         <w:tc>
           <w:tcPr>
-            <w:tcW w:type="dxa" w:w="800"/>
-            <w:tcBorders>
-              <w:top w:val="single" w:color="999999" w:sz="4"/>
-              <w:left w:val="single" w:color="999999" w:sz="4"/>
-              <w:bottom w:val="single" w:color="999999" w:sz="4"/>
-              <w:right w:val="single" w:color="999999" w:sz="4"/>
-            </w:tcBorders>
-            <w:tcMar>
-              <w:top w:type="dxa" w:w="60"/>
-              <w:left w:type="dxa" w:w="100"/>
-              <w:bottom w:type="dxa" w:w="60"/>
-              <w:right w:type="dxa" w:w="100"/>
-            </w:tcMar>
-          </w:tcPr>
-          <w:p>
-            <w:r>
-              <w:rPr>
-                <w:b w:val="false"/>
-                <w:bCs w:val="false"/>
-                <w:sz w:val="18"/>
-                <w:szCs w:val="18"/>
-              </w:rPr>
-              <w:t xml:space="preserve">#15</w:t>
-            </w:r>
-          </w:p>
-        </w:tc>
-        <w:tc>
-          <w:tcPr>
-            <w:tcW w:type="dxa" w:w="7360"/>
+            <w:tcW w:type="dxa" w:w="8160"/>
             <w:tcBorders>
               <w:top w:val="single" w:color="999999" w:sz="4"/>
               <w:left w:val="single" w:color="999999" w:sz="4"/>
@@ -4049,35 +3315,7 @@
         </w:trPr>
         <w:tc>
           <w:tcPr>
-            <w:tcW w:type="dxa" w:w="800"/>
-            <w:tcBorders>
-              <w:top w:val="single" w:color="999999" w:sz="4"/>
-              <w:left w:val="single" w:color="999999" w:sz="4"/>
-              <w:bottom w:val="single" w:color="999999" w:sz="4"/>
-              <w:right w:val="single" w:color="999999" w:sz="4"/>
-            </w:tcBorders>
-            <w:tcMar>
-              <w:top w:type="dxa" w:w="60"/>
-              <w:left w:type="dxa" w:w="100"/>
-              <w:bottom w:type="dxa" w:w="60"/>
-              <w:right w:type="dxa" w:w="100"/>
-            </w:tcMar>
-          </w:tcPr>
-          <w:p>
-            <w:r>
-              <w:rPr>
-                <w:b w:val="false"/>
-                <w:bCs w:val="false"/>
-                <w:sz w:val="18"/>
-                <w:szCs w:val="18"/>
-              </w:rPr>
-              <w:t xml:space="preserve">#33</w:t>
-            </w:r>
-          </w:p>
-        </w:tc>
-        <w:tc>
-          <w:tcPr>
-            <w:tcW w:type="dxa" w:w="7360"/>
+            <w:tcW w:type="dxa" w:w="8160"/>
             <w:tcBorders>
               <w:top w:val="single" w:color="999999" w:sz="4"/>
               <w:left w:val="single" w:color="999999" w:sz="4"/>
@@ -4138,35 +3376,7 @@
         </w:trPr>
         <w:tc>
           <w:tcPr>
-            <w:tcW w:type="dxa" w:w="800"/>
-            <w:tcBorders>
-              <w:top w:val="single" w:color="999999" w:sz="4"/>
-              <w:left w:val="single" w:color="999999" w:sz="4"/>
-              <w:bottom w:val="single" w:color="999999" w:sz="4"/>
-              <w:right w:val="single" w:color="999999" w:sz="4"/>
-            </w:tcBorders>
-            <w:tcMar>
-              <w:top w:type="dxa" w:w="60"/>
-              <w:left w:type="dxa" w:w="100"/>
-              <w:bottom w:type="dxa" w:w="60"/>
-              <w:right w:type="dxa" w:w="100"/>
-            </w:tcMar>
-          </w:tcPr>
-          <w:p>
-            <w:r>
-              <w:rPr>
-                <w:b w:val="false"/>
-                <w:bCs w:val="false"/>
-                <w:sz w:val="18"/>
-                <w:szCs w:val="18"/>
-              </w:rPr>
-              <w:t xml:space="preserve">#99</w:t>
-            </w:r>
-          </w:p>
-        </w:tc>
-        <w:tc>
-          <w:tcPr>
-            <w:tcW w:type="dxa" w:w="7360"/>
+            <w:tcW w:type="dxa" w:w="8160"/>
             <w:tcBorders>
               <w:top w:val="single" w:color="999999" w:sz="4"/>
               <w:left w:val="single" w:color="999999" w:sz="4"/>
@@ -4227,35 +3437,7 @@
         </w:trPr>
         <w:tc>
           <w:tcPr>
-            <w:tcW w:type="dxa" w:w="800"/>
-            <w:tcBorders>
-              <w:top w:val="single" w:color="999999" w:sz="4"/>
-              <w:left w:val="single" w:color="999999" w:sz="4"/>
-              <w:bottom w:val="single" w:color="999999" w:sz="4"/>
-              <w:right w:val="single" w:color="999999" w:sz="4"/>
-            </w:tcBorders>
-            <w:tcMar>
-              <w:top w:type="dxa" w:w="60"/>
-              <w:left w:type="dxa" w:w="100"/>
-              <w:bottom w:type="dxa" w:w="60"/>
-              <w:right w:type="dxa" w:w="100"/>
-            </w:tcMar>
-          </w:tcPr>
-          <w:p>
-            <w:r>
-              <w:rPr>
-                <w:b w:val="false"/>
-                <w:bCs w:val="false"/>
-                <w:sz w:val="18"/>
-                <w:szCs w:val="18"/>
-              </w:rPr>
-              <w:t xml:space="preserve">#100</w:t>
-            </w:r>
-          </w:p>
-        </w:tc>
-        <w:tc>
-          <w:tcPr>
-            <w:tcW w:type="dxa" w:w="7360"/>
+            <w:tcW w:type="dxa" w:w="8160"/>
             <w:tcBorders>
               <w:top w:val="single" w:color="999999" w:sz="4"/>
               <w:left w:val="single" w:color="999999" w:sz="4"/>
@@ -4337,8 +3519,7 @@
         </w:tblBorders>
       </w:tblPr>
       <w:tblGrid>
-        <w:gridCol w:w="800"/>
-        <w:gridCol w:w="7360"/>
+        <w:gridCol w:w="8160"/>
         <w:gridCol w:w="1200"/>
       </w:tblGrid>
       <w:tr>
@@ -4347,36 +3528,7 @@
         </w:trPr>
         <w:tc>
           <w:tcPr>
-            <w:tcW w:type="dxa" w:w="800"/>
-            <w:tcBorders>
-              <w:top w:val="single" w:color="999999" w:sz="4"/>
-              <w:left w:val="single" w:color="999999" w:sz="4"/>
-              <w:bottom w:val="single" w:color="999999" w:sz="4"/>
-              <w:right w:val="single" w:color="999999" w:sz="4"/>
-            </w:tcBorders>
-            <w:shd w:fill="D9E2F3" w:val="clear"/>
-            <w:tcMar>
-              <w:top w:type="dxa" w:w="60"/>
-              <w:left w:type="dxa" w:w="100"/>
-              <w:bottom w:type="dxa" w:w="60"/>
-              <w:right w:type="dxa" w:w="100"/>
-            </w:tcMar>
-          </w:tcPr>
-          <w:p>
-            <w:r>
-              <w:rPr>
-                <w:b/>
-                <w:bCs/>
-                <w:sz w:val="18"/>
-                <w:szCs w:val="18"/>
-              </w:rPr>
-              <w:t xml:space="preserve">Issue</w:t>
-            </w:r>
-          </w:p>
-        </w:tc>
-        <w:tc>
-          <w:tcPr>
-            <w:tcW w:type="dxa" w:w="7360"/>
+            <w:tcW w:type="dxa" w:w="8160"/>
             <w:tcBorders>
               <w:top w:val="single" w:color="999999" w:sz="4"/>
               <w:left w:val="single" w:color="999999" w:sz="4"/>
@@ -4439,35 +3591,7 @@
         </w:trPr>
         <w:tc>
           <w:tcPr>
-            <w:tcW w:type="dxa" w:w="800"/>
-            <w:tcBorders>
-              <w:top w:val="single" w:color="999999" w:sz="4"/>
-              <w:left w:val="single" w:color="999999" w:sz="4"/>
-              <w:bottom w:val="single" w:color="999999" w:sz="4"/>
-              <w:right w:val="single" w:color="999999" w:sz="4"/>
-            </w:tcBorders>
-            <w:tcMar>
-              <w:top w:type="dxa" w:w="60"/>
-              <w:left w:type="dxa" w:w="100"/>
-              <w:bottom w:type="dxa" w:w="60"/>
-              <w:right w:type="dxa" w:w="100"/>
-            </w:tcMar>
-          </w:tcPr>
-          <w:p>
-            <w:r>
-              <w:rPr>
-                <w:b w:val="false"/>
-                <w:bCs w:val="false"/>
-                <w:sz w:val="18"/>
-                <w:szCs w:val="18"/>
-              </w:rPr>
-              <w:t xml:space="preserve">#16</w:t>
-            </w:r>
-          </w:p>
-        </w:tc>
-        <w:tc>
-          <w:tcPr>
-            <w:tcW w:type="dxa" w:w="7360"/>
+            <w:tcW w:type="dxa" w:w="8160"/>
             <w:tcBorders>
               <w:top w:val="single" w:color="999999" w:sz="4"/>
               <w:left w:val="single" w:color="999999" w:sz="4"/>
@@ -4528,35 +3652,7 @@
         </w:trPr>
         <w:tc>
           <w:tcPr>
-            <w:tcW w:type="dxa" w:w="800"/>
-            <w:tcBorders>
-              <w:top w:val="single" w:color="999999" w:sz="4"/>
-              <w:left w:val="single" w:color="999999" w:sz="4"/>
-              <w:bottom w:val="single" w:color="999999" w:sz="4"/>
-              <w:right w:val="single" w:color="999999" w:sz="4"/>
-            </w:tcBorders>
-            <w:tcMar>
-              <w:top w:type="dxa" w:w="60"/>
-              <w:left w:type="dxa" w:w="100"/>
-              <w:bottom w:type="dxa" w:w="60"/>
-              <w:right w:type="dxa" w:w="100"/>
-            </w:tcMar>
-          </w:tcPr>
-          <w:p>
-            <w:r>
-              <w:rPr>
-                <w:b w:val="false"/>
-                <w:bCs w:val="false"/>
-                <w:sz w:val="18"/>
-                <w:szCs w:val="18"/>
-              </w:rPr>
-              <w:t xml:space="preserve">#93</w:t>
-            </w:r>
-          </w:p>
-        </w:tc>
-        <w:tc>
-          <w:tcPr>
-            <w:tcW w:type="dxa" w:w="7360"/>
+            <w:tcW w:type="dxa" w:w="8160"/>
             <w:tcBorders>
               <w:top w:val="single" w:color="999999" w:sz="4"/>
               <w:left w:val="single" w:color="999999" w:sz="4"/>
@@ -4617,35 +3713,7 @@
         </w:trPr>
         <w:tc>
           <w:tcPr>
-            <w:tcW w:type="dxa" w:w="800"/>
-            <w:tcBorders>
-              <w:top w:val="single" w:color="999999" w:sz="4"/>
-              <w:left w:val="single" w:color="999999" w:sz="4"/>
-              <w:bottom w:val="single" w:color="999999" w:sz="4"/>
-              <w:right w:val="single" w:color="999999" w:sz="4"/>
-            </w:tcBorders>
-            <w:tcMar>
-              <w:top w:type="dxa" w:w="60"/>
-              <w:left w:type="dxa" w:w="100"/>
-              <w:bottom w:type="dxa" w:w="60"/>
-              <w:right w:type="dxa" w:w="100"/>
-            </w:tcMar>
-          </w:tcPr>
-          <w:p>
-            <w:r>
-              <w:rPr>
-                <w:b w:val="false"/>
-                <w:bCs w:val="false"/>
-                <w:sz w:val="18"/>
-                <w:szCs w:val="18"/>
-              </w:rPr>
-              <w:t xml:space="preserve">#94</w:t>
-            </w:r>
-          </w:p>
-        </w:tc>
-        <w:tc>
-          <w:tcPr>
-            <w:tcW w:type="dxa" w:w="7360"/>
+            <w:tcW w:type="dxa" w:w="8160"/>
             <w:tcBorders>
               <w:top w:val="single" w:color="999999" w:sz="4"/>
               <w:left w:val="single" w:color="999999" w:sz="4"/>
@@ -4706,35 +3774,7 @@
         </w:trPr>
         <w:tc>
           <w:tcPr>
-            <w:tcW w:type="dxa" w:w="800"/>
-            <w:tcBorders>
-              <w:top w:val="single" w:color="999999" w:sz="4"/>
-              <w:left w:val="single" w:color="999999" w:sz="4"/>
-              <w:bottom w:val="single" w:color="999999" w:sz="4"/>
-              <w:right w:val="single" w:color="999999" w:sz="4"/>
-            </w:tcBorders>
-            <w:tcMar>
-              <w:top w:type="dxa" w:w="60"/>
-              <w:left w:type="dxa" w:w="100"/>
-              <w:bottom w:type="dxa" w:w="60"/>
-              <w:right w:type="dxa" w:w="100"/>
-            </w:tcMar>
-          </w:tcPr>
-          <w:p>
-            <w:r>
-              <w:rPr>
-                <w:b w:val="false"/>
-                <w:bCs w:val="false"/>
-                <w:sz w:val="18"/>
-                <w:szCs w:val="18"/>
-              </w:rPr>
-              <w:t xml:space="preserve">#101</w:t>
-            </w:r>
-          </w:p>
-        </w:tc>
-        <w:tc>
-          <w:tcPr>
-            <w:tcW w:type="dxa" w:w="7360"/>
+            <w:tcW w:type="dxa" w:w="8160"/>
             <w:tcBorders>
               <w:top w:val="single" w:color="999999" w:sz="4"/>
               <w:left w:val="single" w:color="999999" w:sz="4"/>
@@ -4816,8 +3856,7 @@
         </w:tblBorders>
       </w:tblPr>
       <w:tblGrid>
-        <w:gridCol w:w="800"/>
-        <w:gridCol w:w="7360"/>
+        <w:gridCol w:w="8160"/>
         <w:gridCol w:w="1200"/>
       </w:tblGrid>
       <w:tr>
@@ -4826,36 +3865,7 @@
         </w:trPr>
         <w:tc>
           <w:tcPr>
-            <w:tcW w:type="dxa" w:w="800"/>
-            <w:tcBorders>
-              <w:top w:val="single" w:color="999999" w:sz="4"/>
-              <w:left w:val="single" w:color="999999" w:sz="4"/>
-              <w:bottom w:val="single" w:color="999999" w:sz="4"/>
-              <w:right w:val="single" w:color="999999" w:sz="4"/>
-            </w:tcBorders>
-            <w:shd w:fill="D9E2F3" w:val="clear"/>
-            <w:tcMar>
-              <w:top w:type="dxa" w:w="60"/>
-              <w:left w:type="dxa" w:w="100"/>
-              <w:bottom w:type="dxa" w:w="60"/>
-              <w:right w:type="dxa" w:w="100"/>
-            </w:tcMar>
-          </w:tcPr>
-          <w:p>
-            <w:r>
-              <w:rPr>
-                <w:b/>
-                <w:bCs/>
-                <w:sz w:val="18"/>
-                <w:szCs w:val="18"/>
-              </w:rPr>
-              <w:t xml:space="preserve">Issue</w:t>
-            </w:r>
-          </w:p>
-        </w:tc>
-        <w:tc>
-          <w:tcPr>
-            <w:tcW w:type="dxa" w:w="7360"/>
+            <w:tcW w:type="dxa" w:w="8160"/>
             <w:tcBorders>
               <w:top w:val="single" w:color="999999" w:sz="4"/>
               <w:left w:val="single" w:color="999999" w:sz="4"/>
@@ -4918,35 +3928,7 @@
         </w:trPr>
         <w:tc>
           <w:tcPr>
-            <w:tcW w:type="dxa" w:w="800"/>
-            <w:tcBorders>
-              <w:top w:val="single" w:color="999999" w:sz="4"/>
-              <w:left w:val="single" w:color="999999" w:sz="4"/>
-              <w:bottom w:val="single" w:color="999999" w:sz="4"/>
-              <w:right w:val="single" w:color="999999" w:sz="4"/>
-            </w:tcBorders>
-            <w:tcMar>
-              <w:top w:type="dxa" w:w="60"/>
-              <w:left w:type="dxa" w:w="100"/>
-              <w:bottom w:type="dxa" w:w="60"/>
-              <w:right w:type="dxa" w:w="100"/>
-            </w:tcMar>
-          </w:tcPr>
-          <w:p>
-            <w:r>
-              <w:rPr>
-                <w:b w:val="false"/>
-                <w:bCs w:val="false"/>
-                <w:sz w:val="18"/>
-                <w:szCs w:val="18"/>
-              </w:rPr>
-              <w:t xml:space="preserve">#34</w:t>
-            </w:r>
-          </w:p>
-        </w:tc>
-        <w:tc>
-          <w:tcPr>
-            <w:tcW w:type="dxa" w:w="7360"/>
+            <w:tcW w:type="dxa" w:w="8160"/>
             <w:tcBorders>
               <w:top w:val="single" w:color="999999" w:sz="4"/>
               <w:left w:val="single" w:color="999999" w:sz="4"/>
@@ -5007,35 +3989,7 @@
         </w:trPr>
         <w:tc>
           <w:tcPr>
-            <w:tcW w:type="dxa" w:w="800"/>
-            <w:tcBorders>
-              <w:top w:val="single" w:color="999999" w:sz="4"/>
-              <w:left w:val="single" w:color="999999" w:sz="4"/>
-              <w:bottom w:val="single" w:color="999999" w:sz="4"/>
-              <w:right w:val="single" w:color="999999" w:sz="4"/>
-            </w:tcBorders>
-            <w:tcMar>
-              <w:top w:type="dxa" w:w="60"/>
-              <w:left w:type="dxa" w:w="100"/>
-              <w:bottom w:type="dxa" w:w="60"/>
-              <w:right w:type="dxa" w:w="100"/>
-            </w:tcMar>
-          </w:tcPr>
-          <w:p>
-            <w:r>
-              <w:rPr>
-                <w:b w:val="false"/>
-                <w:bCs w:val="false"/>
-                <w:sz w:val="18"/>
-                <w:szCs w:val="18"/>
-              </w:rPr>
-              <w:t xml:space="preserve">#95</w:t>
-            </w:r>
-          </w:p>
-        </w:tc>
-        <w:tc>
-          <w:tcPr>
-            <w:tcW w:type="dxa" w:w="7360"/>
+            <w:tcW w:type="dxa" w:w="8160"/>
             <w:tcBorders>
               <w:top w:val="single" w:color="999999" w:sz="4"/>
               <w:left w:val="single" w:color="999999" w:sz="4"/>
@@ -5096,35 +4050,7 @@
         </w:trPr>
         <w:tc>
           <w:tcPr>
-            <w:tcW w:type="dxa" w:w="800"/>
-            <w:tcBorders>
-              <w:top w:val="single" w:color="999999" w:sz="4"/>
-              <w:left w:val="single" w:color="999999" w:sz="4"/>
-              <w:bottom w:val="single" w:color="999999" w:sz="4"/>
-              <w:right w:val="single" w:color="999999" w:sz="4"/>
-            </w:tcBorders>
-            <w:tcMar>
-              <w:top w:type="dxa" w:w="60"/>
-              <w:left w:type="dxa" w:w="100"/>
-              <w:bottom w:type="dxa" w:w="60"/>
-              <w:right w:type="dxa" w:w="100"/>
-            </w:tcMar>
-          </w:tcPr>
-          <w:p>
-            <w:r>
-              <w:rPr>
-                <w:b w:val="false"/>
-                <w:bCs w:val="false"/>
-                <w:sz w:val="18"/>
-                <w:szCs w:val="18"/>
-              </w:rPr>
-              <w:t xml:space="preserve">#96</w:t>
-            </w:r>
-          </w:p>
-        </w:tc>
-        <w:tc>
-          <w:tcPr>
-            <w:tcW w:type="dxa" w:w="7360"/>
+            <w:tcW w:type="dxa" w:w="8160"/>
             <w:tcBorders>
               <w:top w:val="single" w:color="999999" w:sz="4"/>
               <w:left w:val="single" w:color="999999" w:sz="4"/>
@@ -5185,35 +4111,7 @@
         </w:trPr>
         <w:tc>
           <w:tcPr>
-            <w:tcW w:type="dxa" w:w="800"/>
-            <w:tcBorders>
-              <w:top w:val="single" w:color="999999" w:sz="4"/>
-              <w:left w:val="single" w:color="999999" w:sz="4"/>
-              <w:bottom w:val="single" w:color="999999" w:sz="4"/>
-              <w:right w:val="single" w:color="999999" w:sz="4"/>
-            </w:tcBorders>
-            <w:tcMar>
-              <w:top w:type="dxa" w:w="60"/>
-              <w:left w:type="dxa" w:w="100"/>
-              <w:bottom w:type="dxa" w:w="60"/>
-              <w:right w:type="dxa" w:w="100"/>
-            </w:tcMar>
-          </w:tcPr>
-          <w:p>
-            <w:r>
-              <w:rPr>
-                <w:b w:val="false"/>
-                <w:bCs w:val="false"/>
-                <w:sz w:val="18"/>
-                <w:szCs w:val="18"/>
-              </w:rPr>
-              <w:t xml:space="preserve">#102</w:t>
-            </w:r>
-          </w:p>
-        </w:tc>
-        <w:tc>
-          <w:tcPr>
-            <w:tcW w:type="dxa" w:w="7360"/>
+            <w:tcW w:type="dxa" w:w="8160"/>
             <w:tcBorders>
               <w:top w:val="single" w:color="999999" w:sz="4"/>
               <w:left w:val="single" w:color="999999" w:sz="4"/>
@@ -5274,35 +4172,7 @@
         </w:trPr>
         <w:tc>
           <w:tcPr>
-            <w:tcW w:type="dxa" w:w="800"/>
-            <w:tcBorders>
-              <w:top w:val="single" w:color="999999" w:sz="4"/>
-              <w:left w:val="single" w:color="999999" w:sz="4"/>
-              <w:bottom w:val="single" w:color="999999" w:sz="4"/>
-              <w:right w:val="single" w:color="999999" w:sz="4"/>
-            </w:tcBorders>
-            <w:tcMar>
-              <w:top w:type="dxa" w:w="60"/>
-              <w:left w:type="dxa" w:w="100"/>
-              <w:bottom w:type="dxa" w:w="60"/>
-              <w:right w:type="dxa" w:w="100"/>
-            </w:tcMar>
-          </w:tcPr>
-          <w:p>
-            <w:r>
-              <w:rPr>
-                <w:b w:val="false"/>
-                <w:bCs w:val="false"/>
-                <w:sz w:val="18"/>
-                <w:szCs w:val="18"/>
-              </w:rPr>
-              <w:t xml:space="preserve">#103</w:t>
-            </w:r>
-          </w:p>
-        </w:tc>
-        <w:tc>
-          <w:tcPr>
-            <w:tcW w:type="dxa" w:w="7360"/>
+            <w:tcW w:type="dxa" w:w="8160"/>
             <w:tcBorders>
               <w:top w:val="single" w:color="999999" w:sz="4"/>
               <w:left w:val="single" w:color="999999" w:sz="4"/>
@@ -5384,8 +4254,7 @@
         </w:tblBorders>
       </w:tblPr>
       <w:tblGrid>
-        <w:gridCol w:w="800"/>
-        <w:gridCol w:w="7360"/>
+        <w:gridCol w:w="8160"/>
         <w:gridCol w:w="1200"/>
       </w:tblGrid>
       <w:tr>
@@ -5394,36 +4263,7 @@
         </w:trPr>
         <w:tc>
           <w:tcPr>
-            <w:tcW w:type="dxa" w:w="800"/>
-            <w:tcBorders>
-              <w:top w:val="single" w:color="999999" w:sz="4"/>
-              <w:left w:val="single" w:color="999999" w:sz="4"/>
-              <w:bottom w:val="single" w:color="999999" w:sz="4"/>
-              <w:right w:val="single" w:color="999999" w:sz="4"/>
-            </w:tcBorders>
-            <w:shd w:fill="D9E2F3" w:val="clear"/>
-            <w:tcMar>
-              <w:top w:type="dxa" w:w="60"/>
-              <w:left w:type="dxa" w:w="100"/>
-              <w:bottom w:type="dxa" w:w="60"/>
-              <w:right w:type="dxa" w:w="100"/>
-            </w:tcMar>
-          </w:tcPr>
-          <w:p>
-            <w:r>
-              <w:rPr>
-                <w:b/>
-                <w:bCs/>
-                <w:sz w:val="18"/>
-                <w:szCs w:val="18"/>
-              </w:rPr>
-              <w:t xml:space="preserve">Issue</w:t>
-            </w:r>
-          </w:p>
-        </w:tc>
-        <w:tc>
-          <w:tcPr>
-            <w:tcW w:type="dxa" w:w="7360"/>
+            <w:tcW w:type="dxa" w:w="8160"/>
             <w:tcBorders>
               <w:top w:val="single" w:color="999999" w:sz="4"/>
               <w:left w:val="single" w:color="999999" w:sz="4"/>
@@ -5486,35 +4326,7 @@
         </w:trPr>
         <w:tc>
           <w:tcPr>
-            <w:tcW w:type="dxa" w:w="800"/>
-            <w:tcBorders>
-              <w:top w:val="single" w:color="999999" w:sz="4"/>
-              <w:left w:val="single" w:color="999999" w:sz="4"/>
-              <w:bottom w:val="single" w:color="999999" w:sz="4"/>
-              <w:right w:val="single" w:color="999999" w:sz="4"/>
-            </w:tcBorders>
-            <w:tcMar>
-              <w:top w:type="dxa" w:w="60"/>
-              <w:left w:type="dxa" w:w="100"/>
-              <w:bottom w:type="dxa" w:w="60"/>
-              <w:right w:type="dxa" w:w="100"/>
-            </w:tcMar>
-          </w:tcPr>
-          <w:p>
-            <w:r>
-              <w:rPr>
-                <w:b w:val="false"/>
-                <w:bCs w:val="false"/>
-                <w:sz w:val="18"/>
-                <w:szCs w:val="18"/>
-              </w:rPr>
-              <w:t xml:space="preserve">#35</w:t>
-            </w:r>
-          </w:p>
-        </w:tc>
-        <w:tc>
-          <w:tcPr>
-            <w:tcW w:type="dxa" w:w="7360"/>
+            <w:tcW w:type="dxa" w:w="8160"/>
             <w:tcBorders>
               <w:top w:val="single" w:color="999999" w:sz="4"/>
               <w:left w:val="single" w:color="999999" w:sz="4"/>
@@ -5575,35 +4387,7 @@
         </w:trPr>
         <w:tc>
           <w:tcPr>
-            <w:tcW w:type="dxa" w:w="800"/>
-            <w:tcBorders>
-              <w:top w:val="single" w:color="999999" w:sz="4"/>
-              <w:left w:val="single" w:color="999999" w:sz="4"/>
-              <w:bottom w:val="single" w:color="999999" w:sz="4"/>
-              <w:right w:val="single" w:color="999999" w:sz="4"/>
-            </w:tcBorders>
-            <w:tcMar>
-              <w:top w:type="dxa" w:w="60"/>
-              <w:left w:type="dxa" w:w="100"/>
-              <w:bottom w:type="dxa" w:w="60"/>
-              <w:right w:type="dxa" w:w="100"/>
-            </w:tcMar>
-          </w:tcPr>
-          <w:p>
-            <w:r>
-              <w:rPr>
-                <w:b w:val="false"/>
-                <w:bCs w:val="false"/>
-                <w:sz w:val="18"/>
-                <w:szCs w:val="18"/>
-              </w:rPr>
-              <w:t xml:space="preserve">#36</w:t>
-            </w:r>
-          </w:p>
-        </w:tc>
-        <w:tc>
-          <w:tcPr>
-            <w:tcW w:type="dxa" w:w="7360"/>
+            <w:tcW w:type="dxa" w:w="8160"/>
             <w:tcBorders>
               <w:top w:val="single" w:color="999999" w:sz="4"/>
               <w:left w:val="single" w:color="999999" w:sz="4"/>
@@ -5664,35 +4448,7 @@
         </w:trPr>
         <w:tc>
           <w:tcPr>
-            <w:tcW w:type="dxa" w:w="800"/>
-            <w:tcBorders>
-              <w:top w:val="single" w:color="999999" w:sz="4"/>
-              <w:left w:val="single" w:color="999999" w:sz="4"/>
-              <w:bottom w:val="single" w:color="999999" w:sz="4"/>
-              <w:right w:val="single" w:color="999999" w:sz="4"/>
-            </w:tcBorders>
-            <w:tcMar>
-              <w:top w:type="dxa" w:w="60"/>
-              <w:left w:type="dxa" w:w="100"/>
-              <w:bottom w:type="dxa" w:w="60"/>
-              <w:right w:type="dxa" w:w="100"/>
-            </w:tcMar>
-          </w:tcPr>
-          <w:p>
-            <w:r>
-              <w:rPr>
-                <w:b w:val="false"/>
-                <w:bCs w:val="false"/>
-                <w:sz w:val="18"/>
-                <w:szCs w:val="18"/>
-              </w:rPr>
-              <w:t xml:space="preserve">#37</w:t>
-            </w:r>
-          </w:p>
-        </w:tc>
-        <w:tc>
-          <w:tcPr>
-            <w:tcW w:type="dxa" w:w="7360"/>
+            <w:tcW w:type="dxa" w:w="8160"/>
             <w:tcBorders>
               <w:top w:val="single" w:color="999999" w:sz="4"/>
               <w:left w:val="single" w:color="999999" w:sz="4"/>
@@ -5753,35 +4509,7 @@
         </w:trPr>
         <w:tc>
           <w:tcPr>
-            <w:tcW w:type="dxa" w:w="800"/>
-            <w:tcBorders>
-              <w:top w:val="single" w:color="999999" w:sz="4"/>
-              <w:left w:val="single" w:color="999999" w:sz="4"/>
-              <w:bottom w:val="single" w:color="999999" w:sz="4"/>
-              <w:right w:val="single" w:color="999999" w:sz="4"/>
-            </w:tcBorders>
-            <w:tcMar>
-              <w:top w:type="dxa" w:w="60"/>
-              <w:left w:type="dxa" w:w="100"/>
-              <w:bottom w:type="dxa" w:w="60"/>
-              <w:right w:type="dxa" w:w="100"/>
-            </w:tcMar>
-          </w:tcPr>
-          <w:p>
-            <w:r>
-              <w:rPr>
-                <w:b w:val="false"/>
-                <w:bCs w:val="false"/>
-                <w:sz w:val="18"/>
-                <w:szCs w:val="18"/>
-              </w:rPr>
-              <w:t xml:space="preserve">#104</w:t>
-            </w:r>
-          </w:p>
-        </w:tc>
-        <w:tc>
-          <w:tcPr>
-            <w:tcW w:type="dxa" w:w="7360"/>
+            <w:tcW w:type="dxa" w:w="8160"/>
             <w:tcBorders>
               <w:top w:val="single" w:color="999999" w:sz="4"/>
               <w:left w:val="single" w:color="999999" w:sz="4"/>
@@ -5863,8 +4591,7 @@
         </w:tblBorders>
       </w:tblPr>
       <w:tblGrid>
-        <w:gridCol w:w="800"/>
-        <w:gridCol w:w="7360"/>
+        <w:gridCol w:w="8160"/>
         <w:gridCol w:w="1200"/>
       </w:tblGrid>
       <w:tr>
@@ -5873,36 +4600,7 @@
         </w:trPr>
         <w:tc>
           <w:tcPr>
-            <w:tcW w:type="dxa" w:w="800"/>
-            <w:tcBorders>
-              <w:top w:val="single" w:color="999999" w:sz="4"/>
-              <w:left w:val="single" w:color="999999" w:sz="4"/>
-              <w:bottom w:val="single" w:color="999999" w:sz="4"/>
-              <w:right w:val="single" w:color="999999" w:sz="4"/>
-            </w:tcBorders>
-            <w:shd w:fill="D9E2F3" w:val="clear"/>
-            <w:tcMar>
-              <w:top w:type="dxa" w:w="60"/>
-              <w:left w:type="dxa" w:w="100"/>
-              <w:bottom w:type="dxa" w:w="60"/>
-              <w:right w:type="dxa" w:w="100"/>
-            </w:tcMar>
-          </w:tcPr>
-          <w:p>
-            <w:r>
-              <w:rPr>
-                <w:b/>
-                <w:bCs/>
-                <w:sz w:val="18"/>
-                <w:szCs w:val="18"/>
-              </w:rPr>
-              <w:t xml:space="preserve">Issue</w:t>
-            </w:r>
-          </w:p>
-        </w:tc>
-        <w:tc>
-          <w:tcPr>
-            <w:tcW w:type="dxa" w:w="7360"/>
+            <w:tcW w:type="dxa" w:w="8160"/>
             <w:tcBorders>
               <w:top w:val="single" w:color="999999" w:sz="4"/>
               <w:left w:val="single" w:color="999999" w:sz="4"/>
@@ -5965,35 +4663,7 @@
         </w:trPr>
         <w:tc>
           <w:tcPr>
-            <w:tcW w:type="dxa" w:w="800"/>
-            <w:tcBorders>
-              <w:top w:val="single" w:color="999999" w:sz="4"/>
-              <w:left w:val="single" w:color="999999" w:sz="4"/>
-              <w:bottom w:val="single" w:color="999999" w:sz="4"/>
-              <w:right w:val="single" w:color="999999" w:sz="4"/>
-            </w:tcBorders>
-            <w:tcMar>
-              <w:top w:type="dxa" w:w="60"/>
-              <w:left w:type="dxa" w:w="100"/>
-              <w:bottom w:type="dxa" w:w="60"/>
-              <w:right w:type="dxa" w:w="100"/>
-            </w:tcMar>
-          </w:tcPr>
-          <w:p>
-            <w:r>
-              <w:rPr>
-                <w:b w:val="false"/>
-                <w:bCs w:val="false"/>
-                <w:sz w:val="18"/>
-                <w:szCs w:val="18"/>
-              </w:rPr>
-              <w:t xml:space="preserve">#10</w:t>
-            </w:r>
-          </w:p>
-        </w:tc>
-        <w:tc>
-          <w:tcPr>
-            <w:tcW w:type="dxa" w:w="7360"/>
+            <w:tcW w:type="dxa" w:w="8160"/>
             <w:tcBorders>
               <w:top w:val="single" w:color="999999" w:sz="4"/>
               <w:left w:val="single" w:color="999999" w:sz="4"/>
@@ -6054,35 +4724,7 @@
         </w:trPr>
         <w:tc>
           <w:tcPr>
-            <w:tcW w:type="dxa" w:w="800"/>
-            <w:tcBorders>
-              <w:top w:val="single" w:color="999999" w:sz="4"/>
-              <w:left w:val="single" w:color="999999" w:sz="4"/>
-              <w:bottom w:val="single" w:color="999999" w:sz="4"/>
-              <w:right w:val="single" w:color="999999" w:sz="4"/>
-            </w:tcBorders>
-            <w:tcMar>
-              <w:top w:type="dxa" w:w="60"/>
-              <w:left w:type="dxa" w:w="100"/>
-              <w:bottom w:type="dxa" w:w="60"/>
-              <w:right w:type="dxa" w:w="100"/>
-            </w:tcMar>
-          </w:tcPr>
-          <w:p>
-            <w:r>
-              <w:rPr>
-                <w:b w:val="false"/>
-                <w:bCs w:val="false"/>
-                <w:sz w:val="18"/>
-                <w:szCs w:val="18"/>
-              </w:rPr>
-              <w:t xml:space="preserve">#80</w:t>
-            </w:r>
-          </w:p>
-        </w:tc>
-        <w:tc>
-          <w:tcPr>
-            <w:tcW w:type="dxa" w:w="7360"/>
+            <w:tcW w:type="dxa" w:w="8160"/>
             <w:tcBorders>
               <w:top w:val="single" w:color="999999" w:sz="4"/>
               <w:left w:val="single" w:color="999999" w:sz="4"/>
@@ -6164,8 +4806,7 @@
         </w:tblBorders>
       </w:tblPr>
       <w:tblGrid>
-        <w:gridCol w:w="800"/>
-        <w:gridCol w:w="7360"/>
+        <w:gridCol w:w="8160"/>
         <w:gridCol w:w="1200"/>
       </w:tblGrid>
       <w:tr>
@@ -6174,36 +4815,7 @@
         </w:trPr>
         <w:tc>
           <w:tcPr>
-            <w:tcW w:type="dxa" w:w="800"/>
-            <w:tcBorders>
-              <w:top w:val="single" w:color="999999" w:sz="4"/>
-              <w:left w:val="single" w:color="999999" w:sz="4"/>
-              <w:bottom w:val="single" w:color="999999" w:sz="4"/>
-              <w:right w:val="single" w:color="999999" w:sz="4"/>
-            </w:tcBorders>
-            <w:shd w:fill="D9E2F3" w:val="clear"/>
-            <w:tcMar>
-              <w:top w:type="dxa" w:w="60"/>
-              <w:left w:type="dxa" w:w="100"/>
-              <w:bottom w:type="dxa" w:w="60"/>
-              <w:right w:type="dxa" w:w="100"/>
-            </w:tcMar>
-          </w:tcPr>
-          <w:p>
-            <w:r>
-              <w:rPr>
-                <w:b/>
-                <w:bCs/>
-                <w:sz w:val="18"/>
-                <w:szCs w:val="18"/>
-              </w:rPr>
-              <w:t xml:space="preserve">Issue</w:t>
-            </w:r>
-          </w:p>
-        </w:tc>
-        <w:tc>
-          <w:tcPr>
-            <w:tcW w:type="dxa" w:w="7360"/>
+            <w:tcW w:type="dxa" w:w="8160"/>
             <w:tcBorders>
               <w:top w:val="single" w:color="999999" w:sz="4"/>
               <w:left w:val="single" w:color="999999" w:sz="4"/>
@@ -6266,35 +4878,7 @@
         </w:trPr>
         <w:tc>
           <w:tcPr>
-            <w:tcW w:type="dxa" w:w="800"/>
-            <w:tcBorders>
-              <w:top w:val="single" w:color="999999" w:sz="4"/>
-              <w:left w:val="single" w:color="999999" w:sz="4"/>
-              <w:bottom w:val="single" w:color="999999" w:sz="4"/>
-              <w:right w:val="single" w:color="999999" w:sz="4"/>
-            </w:tcBorders>
-            <w:tcMar>
-              <w:top w:type="dxa" w:w="60"/>
-              <w:left w:type="dxa" w:w="100"/>
-              <w:bottom w:type="dxa" w:w="60"/>
-              <w:right w:type="dxa" w:w="100"/>
-            </w:tcMar>
-          </w:tcPr>
-          <w:p>
-            <w:r>
-              <w:rPr>
-                <w:b w:val="false"/>
-                <w:bCs w:val="false"/>
-                <w:sz w:val="18"/>
-                <w:szCs w:val="18"/>
-              </w:rPr>
-              <w:t xml:space="preserve">#79</w:t>
-            </w:r>
-          </w:p>
-        </w:tc>
-        <w:tc>
-          <w:tcPr>
-            <w:tcW w:type="dxa" w:w="7360"/>
+            <w:tcW w:type="dxa" w:w="8160"/>
             <w:tcBorders>
               <w:top w:val="single" w:color="999999" w:sz="4"/>
               <w:left w:val="single" w:color="999999" w:sz="4"/>
@@ -6355,35 +4939,7 @@
         </w:trPr>
         <w:tc>
           <w:tcPr>
-            <w:tcW w:type="dxa" w:w="800"/>
-            <w:tcBorders>
-              <w:top w:val="single" w:color="999999" w:sz="4"/>
-              <w:left w:val="single" w:color="999999" w:sz="4"/>
-              <w:bottom w:val="single" w:color="999999" w:sz="4"/>
-              <w:right w:val="single" w:color="999999" w:sz="4"/>
-            </w:tcBorders>
-            <w:tcMar>
-              <w:top w:type="dxa" w:w="60"/>
-              <w:left w:type="dxa" w:w="100"/>
-              <w:bottom w:type="dxa" w:w="60"/>
-              <w:right w:type="dxa" w:w="100"/>
-            </w:tcMar>
-          </w:tcPr>
-          <w:p>
-            <w:r>
-              <w:rPr>
-                <w:b w:val="false"/>
-                <w:bCs w:val="false"/>
-                <w:sz w:val="18"/>
-                <w:szCs w:val="18"/>
-              </w:rPr>
-              <w:t xml:space="preserve">#91</w:t>
-            </w:r>
-          </w:p>
-        </w:tc>
-        <w:tc>
-          <w:tcPr>
-            <w:tcW w:type="dxa" w:w="7360"/>
+            <w:tcW w:type="dxa" w:w="8160"/>
             <w:tcBorders>
               <w:top w:val="single" w:color="999999" w:sz="4"/>
               <w:left w:val="single" w:color="999999" w:sz="4"/>
@@ -6444,35 +5000,7 @@
         </w:trPr>
         <w:tc>
           <w:tcPr>
-            <w:tcW w:type="dxa" w:w="800"/>
-            <w:tcBorders>
-              <w:top w:val="single" w:color="999999" w:sz="4"/>
-              <w:left w:val="single" w:color="999999" w:sz="4"/>
-              <w:bottom w:val="single" w:color="999999" w:sz="4"/>
-              <w:right w:val="single" w:color="999999" w:sz="4"/>
-            </w:tcBorders>
-            <w:tcMar>
-              <w:top w:type="dxa" w:w="60"/>
-              <w:left w:type="dxa" w:w="100"/>
-              <w:bottom w:type="dxa" w:w="60"/>
-              <w:right w:type="dxa" w:w="100"/>
-            </w:tcMar>
-          </w:tcPr>
-          <w:p>
-            <w:r>
-              <w:rPr>
-                <w:b w:val="false"/>
-                <w:bCs w:val="false"/>
-                <w:sz w:val="18"/>
-                <w:szCs w:val="18"/>
-              </w:rPr>
-              <w:t xml:space="preserve">#51</w:t>
-            </w:r>
-          </w:p>
-        </w:tc>
-        <w:tc>
-          <w:tcPr>
-            <w:tcW w:type="dxa" w:w="7360"/>
+            <w:tcW w:type="dxa" w:w="8160"/>
             <w:tcBorders>
               <w:top w:val="single" w:color="999999" w:sz="4"/>
               <w:left w:val="single" w:color="999999" w:sz="4"/>
@@ -6533,35 +5061,7 @@
         </w:trPr>
         <w:tc>
           <w:tcPr>
-            <w:tcW w:type="dxa" w:w="800"/>
-            <w:tcBorders>
-              <w:top w:val="single" w:color="999999" w:sz="4"/>
-              <w:left w:val="single" w:color="999999" w:sz="4"/>
-              <w:bottom w:val="single" w:color="999999" w:sz="4"/>
-              <w:right w:val="single" w:color="999999" w:sz="4"/>
-            </w:tcBorders>
-            <w:tcMar>
-              <w:top w:type="dxa" w:w="60"/>
-              <w:left w:type="dxa" w:w="100"/>
-              <w:bottom w:type="dxa" w:w="60"/>
-              <w:right w:type="dxa" w:w="100"/>
-            </w:tcMar>
-          </w:tcPr>
-          <w:p>
-            <w:r>
-              <w:rPr>
-                <w:b w:val="false"/>
-                <w:bCs w:val="false"/>
-                <w:sz w:val="18"/>
-                <w:szCs w:val="18"/>
-              </w:rPr>
-              <w:t xml:space="preserve">#39</w:t>
-            </w:r>
-          </w:p>
-        </w:tc>
-        <w:tc>
-          <w:tcPr>
-            <w:tcW w:type="dxa" w:w="7360"/>
+            <w:tcW w:type="dxa" w:w="8160"/>
             <w:tcBorders>
               <w:top w:val="single" w:color="999999" w:sz="4"/>
               <w:left w:val="single" w:color="999999" w:sz="4"/>
@@ -6622,35 +5122,7 @@
         </w:trPr>
         <w:tc>
           <w:tcPr>
-            <w:tcW w:type="dxa" w:w="800"/>
-            <w:tcBorders>
-              <w:top w:val="single" w:color="999999" w:sz="4"/>
-              <w:left w:val="single" w:color="999999" w:sz="4"/>
-              <w:bottom w:val="single" w:color="999999" w:sz="4"/>
-              <w:right w:val="single" w:color="999999" w:sz="4"/>
-            </w:tcBorders>
-            <w:tcMar>
-              <w:top w:type="dxa" w:w="60"/>
-              <w:left w:type="dxa" w:w="100"/>
-              <w:bottom w:type="dxa" w:w="60"/>
-              <w:right w:type="dxa" w:w="100"/>
-            </w:tcMar>
-          </w:tcPr>
-          <w:p>
-            <w:r>
-              <w:rPr>
-                <w:b w:val="false"/>
-                <w:bCs w:val="false"/>
-                <w:sz w:val="18"/>
-                <w:szCs w:val="18"/>
-              </w:rPr>
-              <w:t xml:space="preserve">#41</w:t>
-            </w:r>
-          </w:p>
-        </w:tc>
-        <w:tc>
-          <w:tcPr>
-            <w:tcW w:type="dxa" w:w="7360"/>
+            <w:tcW w:type="dxa" w:w="8160"/>
             <w:tcBorders>
               <w:top w:val="single" w:color="999999" w:sz="4"/>
               <w:left w:val="single" w:color="999999" w:sz="4"/>
@@ -6711,35 +5183,7 @@
         </w:trPr>
         <w:tc>
           <w:tcPr>
-            <w:tcW w:type="dxa" w:w="800"/>
-            <w:tcBorders>
-              <w:top w:val="single" w:color="999999" w:sz="4"/>
-              <w:left w:val="single" w:color="999999" w:sz="4"/>
-              <w:bottom w:val="single" w:color="999999" w:sz="4"/>
-              <w:right w:val="single" w:color="999999" w:sz="4"/>
-            </w:tcBorders>
-            <w:tcMar>
-              <w:top w:type="dxa" w:w="60"/>
-              <w:left w:type="dxa" w:w="100"/>
-              <w:bottom w:type="dxa" w:w="60"/>
-              <w:right w:type="dxa" w:w="100"/>
-            </w:tcMar>
-          </w:tcPr>
-          <w:p>
-            <w:r>
-              <w:rPr>
-                <w:b w:val="false"/>
-                <w:bCs w:val="false"/>
-                <w:sz w:val="18"/>
-                <w:szCs w:val="18"/>
-              </w:rPr>
-              <w:t xml:space="preserve">#64</w:t>
-            </w:r>
-          </w:p>
-        </w:tc>
-        <w:tc>
-          <w:tcPr>
-            <w:tcW w:type="dxa" w:w="7360"/>
+            <w:tcW w:type="dxa" w:w="8160"/>
             <w:tcBorders>
               <w:top w:val="single" w:color="999999" w:sz="4"/>
               <w:left w:val="single" w:color="999999" w:sz="4"/>
@@ -6800,35 +5244,7 @@
         </w:trPr>
         <w:tc>
           <w:tcPr>
-            <w:tcW w:type="dxa" w:w="800"/>
-            <w:tcBorders>
-              <w:top w:val="single" w:color="999999" w:sz="4"/>
-              <w:left w:val="single" w:color="999999" w:sz="4"/>
-              <w:bottom w:val="single" w:color="999999" w:sz="4"/>
-              <w:right w:val="single" w:color="999999" w:sz="4"/>
-            </w:tcBorders>
-            <w:tcMar>
-              <w:top w:type="dxa" w:w="60"/>
-              <w:left w:type="dxa" w:w="100"/>
-              <w:bottom w:type="dxa" w:w="60"/>
-              <w:right w:type="dxa" w:w="100"/>
-            </w:tcMar>
-          </w:tcPr>
-          <w:p>
-            <w:r>
-              <w:rPr>
-                <w:b w:val="false"/>
-                <w:bCs w:val="false"/>
-                <w:sz w:val="18"/>
-                <w:szCs w:val="18"/>
-              </w:rPr>
-              <w:t xml:space="preserve">#129</w:t>
-            </w:r>
-          </w:p>
-        </w:tc>
-        <w:tc>
-          <w:tcPr>
-            <w:tcW w:type="dxa" w:w="7360"/>
+            <w:tcW w:type="dxa" w:w="8160"/>
             <w:tcBorders>
               <w:top w:val="single" w:color="999999" w:sz="4"/>
               <w:left w:val="single" w:color="999999" w:sz="4"/>
@@ -6912,7 +5328,7 @@
         <w:spacing w:after="60"/>
       </w:pPr>
       <w:r>
-        <w:t xml:space="preserve">Techniek: de back-end is een Web API in Kotlin met Ktor; de database is PostgreSQL, benaderd met Exposed (issue #80). De applicatie draait op de eigen computer met Docker voor de database en ./kotlin run -m rent-a-car.</w:t>
+        <w:t xml:space="preserve">Techniek: de back-end is een Web API in Kotlin met Ktor; de database is PostgreSQL, benaderd met Exposed. De applicatie draait op de eigen computer met Docker voor de database en ./kotlin run -m rent-a-car.</w:t>
       </w:r>
     </w:p>
     <w:p>
@@ -6938,7 +5354,7 @@
         <w:spacing w:after="60"/>
       </w:pPr>
       <w:r>
-        <w:t xml:space="preserve">Structuur: één package per feature (accounts, cars, reservations, trips, organizations, ratings, images), zodat alles over één onderwerp bij elkaar staat (issue #51).</w:t>
+        <w:t xml:space="preserve">Structuur: één package per feature (accounts, cars, reservations, trips, organizations, ratings, images), zodat alles over één onderwerp bij elkaar staat.</w:t>
       </w:r>
     </w:p>
     <w:p>
@@ -6951,7 +5367,7 @@
         <w:spacing w:after="60"/>
       </w:pPr>
       <w:r>
-        <w:t xml:space="preserve">Testen: minstens 3 zinvolle unittests en 3 integratietests voor deel 1; de pure logica heeft snelle unittests zonder server of database (issue #79). De integratietests starten hun eigen Postgres.</w:t>
+        <w:t xml:space="preserve">Testen: minstens 3 zinvolle unittests en 3 integratietests voor deel 1; de pure logica heeft snelle unittests zonder server of database. De integratietests starten hun eigen Postgres.</w:t>
       </w:r>
     </w:p>
     <w:p>
@@ -6964,7 +5380,7 @@
         <w:spacing w:after="60"/>
       </w:pPr>
       <w:r>
-        <w:t xml:space="preserve">Beveiliging: wachtwoorden worden gehasht opgeslagen met een maximale lengte (#63); login-tokens worden alleen als hash opgeslagen en verlopen na 7 dagen (#89); herhaalde mislukte logins worden geweigerd met 429 (#90).</w:t>
+        <w:t xml:space="preserve">Beveiliging: wachtwoorden worden gehasht opgeslagen met een maximale lengte; login-tokens worden alleen als hash opgeslagen en verlopen na 7 dagen; herhaalde mislukte logins worden geweigerd met 429.</w:t>
       </w:r>
     </w:p>
     <w:p>
@@ -6977,7 +5393,7 @@
         <w:spacing w:after="60"/>
       </w:pPr>
       <w:r>
-        <w:t xml:space="preserve">Consistente API: elke fout heeft dezelfde body, lijsten zijn gepagineerd met limit, offset en de header X-Total-Count (#91).</w:t>
+        <w:t xml:space="preserve">Consistente API: elke fout heeft dezelfde body, lijsten zijn gepagineerd met limit, offset en de header X-Total-Count.</w:t>
       </w:r>
     </w:p>
     <w:p>
@@ -7003,7 +5419,7 @@
         <w:spacing w:after="60"/>
       </w:pPr>
       <w:r>
-        <w:t xml:space="preserve">Documentatie: een Swagger UI en OpenAPI-beschrijving van alle endpoints (#39), een README met installatie en gebruik (#64), en UML-diagrammen van het ontwerp (#41).</w:t>
+        <w:t xml:space="preserve">Documentatie: een Swagger UI en OpenAPI-beschrijving van alle endpoints, een README met installatie en gebruik, en UML-diagrammen van het ontwerp.</w:t>
       </w:r>
     </w:p>
     <w:p>
@@ -8326,7 +6742,7 @@
                 <w:sz w:val="18"/>
                 <w:szCs w:val="18"/>
               </w:rPr>
-              <w:t xml:space="preserve">De database-code is in Exposed geschreven, zodat queries en schema getypeerd Kotlin zijn en niet losse JDBC en SQL-scripts (issue #80). Verbindingen komen uit een HikariCP-pool. De tabellen worden bij het opstarten aangemaakt; daardoor hebben we geen migratiegereedschap, en een wijziging van een tabel vraagt een schone database.</w:t>
+              <w:t xml:space="preserve">De database-code is in Exposed geschreven, zodat queries en schema getypeerd Kotlin zijn en niet losse JDBC en SQL-scripts. Verbindingen komen uit een HikariCP-pool. De tabellen worden bij het opstarten aangemaakt; daardoor hebben we geen migratiegereedschap, en een wijziging van een tabel vraagt een schone database.</w:t>
             </w:r>
           </w:p>
         </w:tc>
@@ -8387,7 +6803,7 @@
                 <w:sz w:val="18"/>
                 <w:szCs w:val="18"/>
               </w:rPr>
-              <w:t xml:space="preserve">Alles over een feature staat bij elkaar en een nieuwe feature heeft een duidelijke plek (issue #51). Het nadeel zijn de onderlinge imports die hierboven staan.</w:t>
+              <w:t xml:space="preserve">Alles over een feature staat bij elkaar en een nieuwe feature heeft een duidelijke plek. Het nadeel zijn de onderlinge imports die hierboven staan.</w:t>
             </w:r>
           </w:p>
         </w:tc>
@@ -8570,7 +6986,7 @@
                 <w:sz w:val="18"/>
                 <w:szCs w:val="18"/>
               </w:rPr>
-              <w:t xml:space="preserve">Filteren, kosten, offerte, dagdelen en scoren zijn functies zonder server of database. Daardoor zijn ze in milliseconden te testen met unittests (issue #79).</w:t>
+              <w:t xml:space="preserve">Filteren, kosten, offerte, dagdelen en scoren zijn functies zonder server of database. Daardoor zijn ze in milliseconden te testen met unittests.</w:t>
             </w:r>
           </w:p>
         </w:tc>
@@ -8631,7 +7047,7 @@
                 <w:sz w:val="18"/>
                 <w:szCs w:val="18"/>
               </w:rPr>
-              <w:t xml:space="preserve">StatusPages zet elke fout om naar dezelfde body met een vaste code en een tekst, en lijsten gebruiken limit, offset en X-Total-Count (issue #91). De Android app hoeft zo geen uitzonderingen per endpoint te kennen.</w:t>
+              <w:t xml:space="preserve">StatusPages zet elke fout om naar dezelfde body met een vaste code en een tekst, en lijsten gebruiken limit, offset en X-Total-Count. De Android app hoeft zo geen uitzonderingen per endpoint te kennen.</w:t>
             </w:r>
           </w:p>
         </w:tc>
@@ -22891,7 +21307,7 @@
         <w:spacing w:after="60"/>
       </w:pPr>
       <w:r>
-        <w:t xml:space="preserve">Het Ktor-projectskelet en de migratie van Gradle naar de Kotlin Toolchain (Amper), pull request #7.</w:t>
+        <w:t xml:space="preserve">Het Ktor-projectskelet en de migratie van Gradle naar de Kotlin Toolchain (Amper).</w:t>
       </w:r>
     </w:p>
     <w:p>
@@ -22904,7 +21320,7 @@
         <w:spacing w:after="60"/>
       </w:pPr>
       <w:r>
-        <w:t xml:space="preserve">De autoklassen: de sealed class Car met ICECar, BEVCar en FCEVCar, de enums (BodyStyle, Transmission, FuelType, CarStatus) en Location, samen met GET /cars (#17).</w:t>
+        <w:t xml:space="preserve">De autoklassen: de sealed class Car met ICECar, BEVCar en FCEVCar, de enums (BodyStyle, Transmission, FuelType, CarStatus) en Location, samen met GET /cars.</w:t>
       </w:r>
     </w:p>
     <w:p>
@@ -22917,7 +21333,7 @@
         <w:spacing w:after="60"/>
       </w:pPr>
       <w:r>
-        <w:t xml:space="preserve">De endpoints POST /cars (#66), GET /cars/{id} (#77) en DELETE /cars/{id} (#78).</w:t>
+        <w:t xml:space="preserve">De endpoints POST /cars, GET /cars/{id} en DELETE /cars/{id}.</w:t>
       </w:r>
     </w:p>
     <w:p>

</xml_diff>

<commit_message>
Remove the two fill-in notes from the process chapter
</commit_message>
<xml_diff>
--- a/docs/Ontwikkeldocument.docx
+++ b/docs/Ontwikkeldocument.docx
@@ -21368,19 +21368,6 @@
       </w:pPr>
       <w:r>
         <w:rPr>
-          <w:i/>
-          <w:iCs/>
-          <w:highlight w:val="yellow"/>
-        </w:rPr>
-        <w:t xml:space="preserve">[Invullen door Jairo en Rocco: Jairo’s bijdrage aan documentatie, diagrammen en overleg die niet in GitHub te zien is.]</w:t>
-      </w:r>
-    </w:p>
-    <w:p>
-      <w:pPr>
-        <w:spacing w:after="120"/>
-      </w:pPr>
-      <w:r>
-        <w:rPr>
           <w:b/>
           <w:bCs/>
         </w:rPr>
@@ -21481,19 +21468,6 @@
       </w:r>
       <w:r>
         <w:t xml:space="preserve">De verdeling was niet gelijk: het grootste deel van het werk na de eerste autoroutes is door Rocco gedaan. Beoordelen, meedenken en het opzetten van de basis staan niet in de regels code, maar wel in de pull requests en reviews. De basis van het project en de autoklassen zijn van Jairo en zitten nog steeds in elk endpoint.</w:t>
-      </w:r>
-    </w:p>
-    <w:p>
-      <w:pPr>
-        <w:spacing w:after="120"/>
-      </w:pPr>
-      <w:r>
-        <w:rPr>
-          <w:i/>
-          <w:iCs/>
-          <w:highlight w:val="yellow"/>
-        </w:rPr>
-        <w:t xml:space="preserve">[Invullen: hoe jullie overlegden en waarom de verdeling zo is gelopen.]</w:t>
       </w:r>
     </w:p>
     <w:p>

</xml_diff>

<commit_message>
Update the process chapter with the team's wording and the real contribution numbers
</commit_message>
<xml_diff>
--- a/docs/Ontwikkeldocument.docx
+++ b/docs/Ontwikkeldocument.docx
@@ -5473,7 +5473,7 @@
           <wp:inline distT="0" distB="0" distL="0" distR="0">
             <wp:extent cx="5715000" cy="2171700"/>
             <wp:effectExtent t="0" r="0" b="0" l="0"/>
-            <wp:docPr id="1" name="/Users/roccobrand/Avans/rent-a-car/docs/diagrams/components.png" descr="/Users/roccobrand/Avans/rent-a-car/docs/diagrams/components.png" title="/Users/roccobrand/Avans/rent-a-car/docs/diagrams/components.png"/>
+            <wp:docPr id="1" name="/private/tmp/claude-501/-Users-roccobrand-Avans-rent-a-car/ebf87299-1aa9-49a7-a9c7-64b331b1fa6c/scratchpad/wt/docs/diagrams/components.png" descr="/private/tmp/claude-501/-Users-roccobrand-Avans-rent-a-car/ebf87299-1aa9-49a7-a9c7-64b331b1fa6c/scratchpad/wt/docs/diagrams/components.png" title="/private/tmp/claude-501/-Users-roccobrand-Avans-rent-a-car/ebf87299-1aa9-49a7-a9c7-64b331b1fa6c/scratchpad/wt/docs/diagrams/components.png"/>
             <wp:cNvGraphicFramePr>
               <a:graphicFrameLocks xmlns:a="http://schemas.openxmlformats.org/drawingml/2006/main" noChangeAspect="1"/>
             </wp:cNvGraphicFramePr>
@@ -5632,7 +5632,7 @@
           <wp:inline distT="0" distB="0" distL="0" distR="0">
             <wp:extent cx="5905500" cy="1485900"/>
             <wp:effectExtent t="0" r="0" b="0" l="0"/>
-            <wp:docPr id="2" name="/Users/roccobrand/Avans/rent-a-car/docs/diagrams/packages.png" descr="/Users/roccobrand/Avans/rent-a-car/docs/diagrams/packages.png" title="/Users/roccobrand/Avans/rent-a-car/docs/diagrams/packages.png"/>
+            <wp:docPr id="2" name="/private/tmp/claude-501/-Users-roccobrand-Avans-rent-a-car/ebf87299-1aa9-49a7-a9c7-64b331b1fa6c/scratchpad/wt/docs/diagrams/packages.png" descr="/private/tmp/claude-501/-Users-roccobrand-Avans-rent-a-car/ebf87299-1aa9-49a7-a9c7-64b331b1fa6c/scratchpad/wt/docs/diagrams/packages.png" title="/private/tmp/claude-501/-Users-roccobrand-Avans-rent-a-car/ebf87299-1aa9-49a7-a9c7-64b331b1fa6c/scratchpad/wt/docs/diagrams/packages.png"/>
             <wp:cNvGraphicFramePr>
               <a:graphicFrameLocks xmlns:a="http://schemas.openxmlformats.org/drawingml/2006/main" noChangeAspect="1"/>
             </wp:cNvGraphicFramePr>
@@ -7211,7 +7211,7 @@
           <wp:inline distT="0" distB="0" distL="0" distR="0">
             <wp:extent cx="5905500" cy="2933700"/>
             <wp:effectExtent t="0" r="0" b="0" l="0"/>
-            <wp:docPr id="3" name="/Users/roccobrand/Avans/rent-a-car/docs/diagrams/erd.png" descr="/Users/roccobrand/Avans/rent-a-car/docs/diagrams/erd.png" title="/Users/roccobrand/Avans/rent-a-car/docs/diagrams/erd.png"/>
+            <wp:docPr id="3" name="/private/tmp/claude-501/-Users-roccobrand-Avans-rent-a-car/ebf87299-1aa9-49a7-a9c7-64b331b1fa6c/scratchpad/wt/docs/diagrams/erd.png" descr="/private/tmp/claude-501/-Users-roccobrand-Avans-rent-a-car/ebf87299-1aa9-49a7-a9c7-64b331b1fa6c/scratchpad/wt/docs/diagrams/erd.png" title="/private/tmp/claude-501/-Users-roccobrand-Avans-rent-a-car/ebf87299-1aa9-49a7-a9c7-64b331b1fa6c/scratchpad/wt/docs/diagrams/erd.png"/>
             <wp:cNvGraphicFramePr>
               <a:graphicFrameLocks xmlns:a="http://schemas.openxmlformats.org/drawingml/2006/main" noChangeAspect="1"/>
             </wp:cNvGraphicFramePr>
@@ -8765,7 +8765,7 @@
           <wp:inline distT="0" distB="0" distL="0" distR="0">
             <wp:extent cx="3143250" cy="4667250"/>
             <wp:effectExtent t="0" r="0" b="0" l="0"/>
-            <wp:docPr id="4" name="/Users/roccobrand/Avans/rent-a-car/docs/diagrams/use-cases-core.png" descr="/Users/roccobrand/Avans/rent-a-car/docs/diagrams/use-cases-core.png" title="/Users/roccobrand/Avans/rent-a-car/docs/diagrams/use-cases-core.png"/>
+            <wp:docPr id="4" name="/private/tmp/claude-501/-Users-roccobrand-Avans-rent-a-car/ebf87299-1aa9-49a7-a9c7-64b331b1fa6c/scratchpad/wt/docs/diagrams/use-cases-core.png" descr="/private/tmp/claude-501/-Users-roccobrand-Avans-rent-a-car/ebf87299-1aa9-49a7-a9c7-64b331b1fa6c/scratchpad/wt/docs/diagrams/use-cases-core.png" title="/private/tmp/claude-501/-Users-roccobrand-Avans-rent-a-car/ebf87299-1aa9-49a7-a9c7-64b331b1fa6c/scratchpad/wt/docs/diagrams/use-cases-core.png"/>
             <wp:cNvGraphicFramePr>
               <a:graphicFrameLocks xmlns:a="http://schemas.openxmlformats.org/drawingml/2006/main" noChangeAspect="1"/>
             </wp:cNvGraphicFramePr>
@@ -10394,7 +10394,7 @@
           <wp:inline distT="0" distB="0" distL="0" distR="0">
             <wp:extent cx="5905500" cy="2943225"/>
             <wp:effectExtent t="0" r="0" b="0" l="0"/>
-            <wp:docPr id="5" name="/Users/roccobrand/Avans/rent-a-car/docs/diagrams/class-core.png" descr="/Users/roccobrand/Avans/rent-a-car/docs/diagrams/class-core.png" title="/Users/roccobrand/Avans/rent-a-car/docs/diagrams/class-core.png"/>
+            <wp:docPr id="5" name="/private/tmp/claude-501/-Users-roccobrand-Avans-rent-a-car/ebf87299-1aa9-49a7-a9c7-64b331b1fa6c/scratchpad/wt/docs/diagrams/class-core.png" descr="/private/tmp/claude-501/-Users-roccobrand-Avans-rent-a-car/ebf87299-1aa9-49a7-a9c7-64b331b1fa6c/scratchpad/wt/docs/diagrams/class-core.png" title="/private/tmp/claude-501/-Users-roccobrand-Avans-rent-a-car/ebf87299-1aa9-49a7-a9c7-64b331b1fa6c/scratchpad/wt/docs/diagrams/class-core.png"/>
             <wp:cNvGraphicFramePr>
               <a:graphicFrameLocks xmlns:a="http://schemas.openxmlformats.org/drawingml/2006/main" noChangeAspect="1"/>
             </wp:cNvGraphicFramePr>
@@ -10614,7 +10614,7 @@
           <wp:inline distT="0" distB="0" distL="0" distR="0">
             <wp:extent cx="5334000" cy="5076825"/>
             <wp:effectExtent t="0" r="0" b="0" l="0"/>
-            <wp:docPr id="6" name="/Users/roccobrand/Avans/rent-a-car/docs/diagrams/sequence-reserve-car.png" descr="/Users/roccobrand/Avans/rent-a-car/docs/diagrams/sequence-reserve-car.png" title="/Users/roccobrand/Avans/rent-a-car/docs/diagrams/sequence-reserve-car.png"/>
+            <wp:docPr id="6" name="/private/tmp/claude-501/-Users-roccobrand-Avans-rent-a-car/ebf87299-1aa9-49a7-a9c7-64b331b1fa6c/scratchpad/wt/docs/diagrams/sequence-reserve-car.png" descr="/private/tmp/claude-501/-Users-roccobrand-Avans-rent-a-car/ebf87299-1aa9-49a7-a9c7-64b331b1fa6c/scratchpad/wt/docs/diagrams/sequence-reserve-car.png" title="/private/tmp/claude-501/-Users-roccobrand-Avans-rent-a-car/ebf87299-1aa9-49a7-a9c7-64b331b1fa6c/scratchpad/wt/docs/diagrams/sequence-reserve-car.png"/>
             <wp:cNvGraphicFramePr>
               <a:graphicFrameLocks xmlns:a="http://schemas.openxmlformats.org/drawingml/2006/main" noChangeAspect="1"/>
             </wp:cNvGraphicFramePr>
@@ -10696,7 +10696,7 @@
           <wp:inline distT="0" distB="0" distL="0" distR="0">
             <wp:extent cx="5905500" cy="6667500"/>
             <wp:effectExtent t="0" r="0" b="0" l="0"/>
-            <wp:docPr id="7" name="/Users/roccobrand/Avans/rent-a-car/docs/diagrams/sequence-record-trip.png" descr="/Users/roccobrand/Avans/rent-a-car/docs/diagrams/sequence-record-trip.png" title="/Users/roccobrand/Avans/rent-a-car/docs/diagrams/sequence-record-trip.png"/>
+            <wp:docPr id="7" name="/private/tmp/claude-501/-Users-roccobrand-Avans-rent-a-car/ebf87299-1aa9-49a7-a9c7-64b331b1fa6c/scratchpad/wt/docs/diagrams/sequence-record-trip.png" descr="/private/tmp/claude-501/-Users-roccobrand-Avans-rent-a-car/ebf87299-1aa9-49a7-a9c7-64b331b1fa6c/scratchpad/wt/docs/diagrams/sequence-record-trip.png" title="/private/tmp/claude-501/-Users-roccobrand-Avans-rent-a-car/ebf87299-1aa9-49a7-a9c7-64b331b1fa6c/scratchpad/wt/docs/diagrams/sequence-record-trip.png"/>
             <wp:cNvGraphicFramePr>
               <a:graphicFrameLocks xmlns:a="http://schemas.openxmlformats.org/drawingml/2006/main" noChangeAspect="1"/>
             </wp:cNvGraphicFramePr>
@@ -10778,7 +10778,7 @@
           <wp:inline distT="0" distB="0" distL="0" distR="0">
             <wp:extent cx="5905500" cy="6419850"/>
             <wp:effectExtent t="0" r="0" b="0" l="0"/>
-            <wp:docPr id="8" name="/Users/roccobrand/Avans/rent-a-car/docs/diagrams/sequence-login.png" descr="/Users/roccobrand/Avans/rent-a-car/docs/diagrams/sequence-login.png" title="/Users/roccobrand/Avans/rent-a-car/docs/diagrams/sequence-login.png"/>
+            <wp:docPr id="8" name="/private/tmp/claude-501/-Users-roccobrand-Avans-rent-a-car/ebf87299-1aa9-49a7-a9c7-64b331b1fa6c/scratchpad/wt/docs/diagrams/sequence-login.png" descr="/private/tmp/claude-501/-Users-roccobrand-Avans-rent-a-car/ebf87299-1aa9-49a7-a9c7-64b331b1fa6c/scratchpad/wt/docs/diagrams/sequence-login.png" title="/private/tmp/claude-501/-Users-roccobrand-Avans-rent-a-car/ebf87299-1aa9-49a7-a9c7-64b331b1fa6c/scratchpad/wt/docs/diagrams/sequence-login.png"/>
             <wp:cNvGraphicFramePr>
               <a:graphicFrameLocks xmlns:a="http://schemas.openxmlformats.org/drawingml/2006/main" noChangeAspect="1"/>
             </wp:cNvGraphicFramePr>
@@ -10860,7 +10860,7 @@
           <wp:inline distT="0" distB="0" distL="0" distR="0">
             <wp:extent cx="5334000" cy="2990850"/>
             <wp:effectExtent t="0" r="0" b="0" l="0"/>
-            <wp:docPr id="9" name="/Users/roccobrand/Avans/rent-a-car/docs/diagrams/sequence-compare-car-types.png" descr="/Users/roccobrand/Avans/rent-a-car/docs/diagrams/sequence-compare-car-types.png" title="/Users/roccobrand/Avans/rent-a-car/docs/diagrams/sequence-compare-car-types.png"/>
+            <wp:docPr id="9" name="/private/tmp/claude-501/-Users-roccobrand-Avans-rent-a-car/ebf87299-1aa9-49a7-a9c7-64b331b1fa6c/scratchpad/wt/docs/diagrams/sequence-compare-car-types.png" descr="/private/tmp/claude-501/-Users-roccobrand-Avans-rent-a-car/ebf87299-1aa9-49a7-a9c7-64b331b1fa6c/scratchpad/wt/docs/diagrams/sequence-compare-car-types.png" title="/private/tmp/claude-501/-Users-roccobrand-Avans-rent-a-car/ebf87299-1aa9-49a7-a9c7-64b331b1fa6c/scratchpad/wt/docs/diagrams/sequence-compare-car-types.png"/>
             <wp:cNvGraphicFramePr>
               <a:graphicFrameLocks xmlns:a="http://schemas.openxmlformats.org/drawingml/2006/main" noChangeAspect="1"/>
             </wp:cNvGraphicFramePr>
@@ -20449,7 +20449,7 @@
         <w:spacing w:after="120"/>
       </w:pPr>
       <w:r>
-        <w:t xml:space="preserve">De cijfers komen uit GitHub en uit git blame (het aantal regels in de huidige versie van de code dat van iemand is). Ze laten zien wat er is gebeurd; de uitleg eronder zegt wat de cijfers niet laten zien.</w:t>
+        <w:t xml:space="preserve">De cijfers komen uit GitHub en uit git blame (het aantal regels in de huidige versie van de code dat van iemand is).</w:t>
       </w:r>
     </w:p>
     <w:tbl>
@@ -21123,95 +21123,6 @@
                 <w:sz w:val="18"/>
                 <w:szCs w:val="18"/>
               </w:rPr>
-              <w:t xml:space="preserve">Regels testcode in de huidige versie (test)</w:t>
-            </w:r>
-          </w:p>
-        </w:tc>
-        <w:tc>
-          <w:tcPr>
-            <w:tcW w:type="dxa" w:w="2580"/>
-            <w:tcBorders>
-              <w:top w:val="single" w:color="999999" w:sz="4"/>
-              <w:left w:val="single" w:color="999999" w:sz="4"/>
-              <w:bottom w:val="single" w:color="999999" w:sz="4"/>
-              <w:right w:val="single" w:color="999999" w:sz="4"/>
-            </w:tcBorders>
-            <w:tcMar>
-              <w:top w:type="dxa" w:w="60"/>
-              <w:left w:type="dxa" w:w="100"/>
-              <w:bottom w:type="dxa" w:w="60"/>
-              <w:right w:type="dxa" w:w="100"/>
-            </w:tcMar>
-          </w:tcPr>
-          <w:p>
-            <w:r>
-              <w:rPr>
-                <w:b w:val="false"/>
-                <w:bCs w:val="false"/>
-                <w:sz w:val="18"/>
-                <w:szCs w:val="18"/>
-              </w:rPr>
-              <w:t xml:space="preserve">6256 (92%)</w:t>
-            </w:r>
-          </w:p>
-        </w:tc>
-        <w:tc>
-          <w:tcPr>
-            <w:tcW w:type="dxa" w:w="2580"/>
-            <w:tcBorders>
-              <w:top w:val="single" w:color="999999" w:sz="4"/>
-              <w:left w:val="single" w:color="999999" w:sz="4"/>
-              <w:bottom w:val="single" w:color="999999" w:sz="4"/>
-              <w:right w:val="single" w:color="999999" w:sz="4"/>
-            </w:tcBorders>
-            <w:tcMar>
-              <w:top w:type="dxa" w:w="60"/>
-              <w:left w:type="dxa" w:w="100"/>
-              <w:bottom w:type="dxa" w:w="60"/>
-              <w:right w:type="dxa" w:w="100"/>
-            </w:tcMar>
-          </w:tcPr>
-          <w:p>
-            <w:r>
-              <w:rPr>
-                <w:b w:val="false"/>
-                <w:bCs w:val="false"/>
-                <w:sz w:val="18"/>
-                <w:szCs w:val="18"/>
-              </w:rPr>
-              <w:t xml:space="preserve">572 (8%)</w:t>
-            </w:r>
-          </w:p>
-        </w:tc>
-      </w:tr>
-      <w:tr>
-        <w:trPr>
-          <w:cantSplit/>
-        </w:trPr>
-        <w:tc>
-          <w:tcPr>
-            <w:tcW w:type="dxa" w:w="4200"/>
-            <w:tcBorders>
-              <w:top w:val="single" w:color="999999" w:sz="4"/>
-              <w:left w:val="single" w:color="999999" w:sz="4"/>
-              <w:bottom w:val="single" w:color="999999" w:sz="4"/>
-              <w:right w:val="single" w:color="999999" w:sz="4"/>
-            </w:tcBorders>
-            <w:tcMar>
-              <w:top w:type="dxa" w:w="60"/>
-              <w:left w:type="dxa" w:w="100"/>
-              <w:bottom w:type="dxa" w:w="60"/>
-              <w:right w:type="dxa" w:w="100"/>
-            </w:tcMar>
-          </w:tcPr>
-          <w:p>
-            <w:r>
-              <w:rPr>
-                <w:b w:val="false"/>
-                <w:bCs w:val="false"/>
-                <w:sz w:val="18"/>
-                <w:szCs w:val="18"/>
-              </w:rPr>
               <w:t xml:space="preserve">Regels console-client (cli)</w:t>
             </w:r>
           </w:p>
@@ -21291,10 +21202,10 @@
           <w:b/>
           <w:bCs/>
         </w:rPr>
-        <w:t xml:space="preserve">Jairo Roosenburg </w:t>
-      </w:r>
-      <w:r>
-        <w:t xml:space="preserve">heeft het project opgezet en het eerste deel van de autofunctionaliteit gebouwd:</w:t>
+        <w:t xml:space="preserve">Jairo </w:t>
+      </w:r>
+      <w:r>
+        <w:t xml:space="preserve">heeft het project en de GitHub repository opgezet en het deel van de autofunctionaliteit gebouwd:</w:t>
       </w:r>
     </w:p>
     <w:p>
@@ -21320,7 +21231,7 @@
         <w:spacing w:after="60"/>
       </w:pPr>
       <w:r>
-        <w:t xml:space="preserve">De autoklassen: de sealed class Car met ICECar, BEVCar en FCEVCar, de enums (BodyStyle, Transmission, FuelType, CarStatus) en Location, samen met GET /cars.</w:t>
+        <w:t xml:space="preserve">De eerste basis voor de UML diagrammen van het project.</w:t>
       </w:r>
     </w:p>
     <w:p>
@@ -21333,7 +21244,7 @@
         <w:spacing w:after="60"/>
       </w:pPr>
       <w:r>
-        <w:t xml:space="preserve">De endpoints POST /cars, GET /cars/{id} en DELETE /cars/{id}.</w:t>
+        <w:t xml:space="preserve">De autoklassen: de sealed class Car met ICECar, BEVCar en FCEVCar, de enums (BodyStyle, Transmission, FuelType, CarStatus) en Location, samen met GET /cars.</w:t>
       </w:r>
     </w:p>
     <w:p>
@@ -21346,7 +21257,7 @@
         <w:spacing w:after="60"/>
       </w:pPr>
       <w:r>
-        <w:t xml:space="preserve">De integratietests van die endpoints: PostCarRoutesTest, GetCarByIdRouteTest, DeleteCarByIdRouteTest en CarRoutesTest (14 tests).</w:t>
+        <w:t xml:space="preserve">De endpoints POST /cars, GET /cars/{id} en DELETE /cars/{id}.</w:t>
       </w:r>
     </w:p>
     <w:p>
@@ -21359,22 +21270,7 @@
         <w:spacing w:after="60"/>
       </w:pPr>
       <w:r>
-        <w:t xml:space="preserve">Het beoordelen van pull requests van de ander: 20 goedkeuringen, 3 keer wijzigingen gevraagd en 5 opmerkingen.</w:t>
-      </w:r>
-    </w:p>
-    <w:p>
-      <w:pPr>
-        <w:spacing w:after="120"/>
-      </w:pPr>
-      <w:r>
-        <w:rPr>
-          <w:b/>
-          <w:bCs/>
-        </w:rPr>
-        <w:t xml:space="preserve">Rocco Brand </w:t>
-      </w:r>
-      <w:r>
-        <w:t xml:space="preserve">heeft daarna de rest van de back-end gebouwd:</w:t>
+        <w:t xml:space="preserve">De integratietests van die endpoints: PostCarRoutesTest, GetCarByIdRouteTest, DeleteCarByIdRouteTest en CarRoutesTest (14 tests).</w:t>
       </w:r>
     </w:p>
     <w:p>
@@ -21387,7 +21283,22 @@
         <w:spacing w:after="60"/>
       </w:pPr>
       <w:r>
-        <w:t xml:space="preserve">Accounts: registreren, inloggen, uitloggen, wijzigen en verwijderen, tokens en de beveiliging tegen gokken van wachtwoorden.</w:t>
+        <w:t xml:space="preserve">De documentatie en de diagrammen, zoals het ontwikkeldocument, het klassendiagram en de uitleg van het domeinmodel.</w:t>
+      </w:r>
+    </w:p>
+    <w:p>
+      <w:pPr>
+        <w:spacing w:after="120"/>
+      </w:pPr>
+      <w:r>
+        <w:rPr>
+          <w:b/>
+          <w:bCs/>
+        </w:rPr>
+        <w:t xml:space="preserve">Rocco </w:t>
+      </w:r>
+      <w:r>
+        <w:t xml:space="preserve">heeft daarna het andere deel van de back-end gebouwd:</w:t>
       </w:r>
     </w:p>
     <w:p>
@@ -21400,7 +21311,7 @@
         <w:spacing w:after="60"/>
       </w:pPr>
       <w:r>
-        <w:t xml:space="preserve">De database: de overstap naar Exposed, PostgreSQL, de tabellen en de seeddata.</w:t>
+        <w:t xml:space="preserve">Accounts: registreren, inloggen, uitloggen, wijzigen en verwijderen, tokens en de beveiliging tegen gokken van wachtwoorden.</w:t>
       </w:r>
     </w:p>
     <w:p>
@@ -21413,7 +21324,7 @@
         <w:spacing w:after="60"/>
       </w:pPr>
       <w:r>
-        <w:t xml:space="preserve">Reserveringen per dagdeel, ritten met bonuspunten, beoordelingen, foto’s, kosten per km, offerte, vergelijken en TCO, organisaties met leden, uitnodigingen en rapport.</w:t>
+        <w:t xml:space="preserve">De database geïmplementeerd in Exposed, PostgreSQL, en de seeddata die hierin staat.</w:t>
       </w:r>
     </w:p>
     <w:p>
@@ -21426,7 +21337,7 @@
         <w:spacing w:after="60"/>
       </w:pPr>
       <w:r>
-        <w:t xml:space="preserve">Het aanpassen van de autoroutes: filteren, sorteren, bijwerken, onderhoud en organisatieauto’s.</w:t>
+        <w:t xml:space="preserve">Reserveringen per dagdeel, ritten met bonuspunten, beoordelingen, foto’s, kosten per km, offerte, vergelijken en TCO, organisaties met leden, uitnodigingen en rapport.</w:t>
       </w:r>
     </w:p>
     <w:p>
@@ -21439,7 +21350,7 @@
         <w:spacing w:after="60"/>
       </w:pPr>
       <w:r>
-        <w:t xml:space="preserve">Paginering en één foutformaat, Swagger UI, README, de UML-diagrammen, de console-client en de tutorial.</w:t>
+        <w:t xml:space="preserve">Het aanpassen van de autoroutes: filteren, sorteren, bijwerken, onderhoud en organisatieauto’s.</w:t>
       </w:r>
     </w:p>
     <w:p>
@@ -21452,7 +21363,20 @@
         <w:spacing w:after="60"/>
       </w:pPr>
       <w:r>
-        <w:t xml:space="preserve">De meeste tests, waaronder alle unittests op de pure logica en de tests voor de database en de beveiliging.</w:t>
+        <w:t xml:space="preserve">Paginering en één foutformaat, Swagger UI, de verder uitgewerkte UML-diagrammen, de console-client en de tutorial.</w:t>
+      </w:r>
+    </w:p>
+    <w:p>
+      <w:pPr>
+        <w:pStyle w:val="ListParagraph"/>
+        <w:numPr>
+          <w:ilvl w:val="0"/>
+          <w:numId w:val="2"/>
+        </w:numPr>
+        <w:spacing w:after="60"/>
+      </w:pPr>
+      <w:r>
+        <w:t xml:space="preserve">De tests voor zijn eigen deel van de code en extra unittests voor andere delen van de code.</w:t>
       </w:r>
     </w:p>
     <w:p>
@@ -21460,14 +21384,15 @@
         <w:spacing w:after="120"/>
       </w:pPr>
       <w:r>
-        <w:rPr>
-          <w:b/>
-          <w:bCs/>
-        </w:rPr>
-        <w:t xml:space="preserve">Wat de cijfers niet laten zien. </w:t>
-      </w:r>
-      <w:r>
-        <w:t xml:space="preserve">De verdeling was niet gelijk: het grootste deel van het werk na de eerste autoroutes is door Rocco gedaan. Beoordelen, meedenken en het opzetten van de basis staan niet in de regels code, maar wel in de pull requests en reviews. De basis van het project en de autoklassen zijn van Jairo en zitten nog steeds in elk endpoint.</w:t>
+        <w:t xml:space="preserve">De verdeling van het werk leunde meer de kant op van Rocco. Jairo zorgde voor een basis van het project, ontwierp de basisdiagrammen voor de eerste versie, schreef de code en daarbij de integratietests voor auto’s en werkte aan de documentatie.</w:t>
+      </w:r>
+    </w:p>
+    <w:p>
+      <w:pPr>
+        <w:spacing w:after="120"/>
+      </w:pPr>
+      <w:r>
+        <w:t xml:space="preserve">Rocco werkte aan de database-integratie in Exposed, zorgde voor de login- en authenticatielogica, en aan de gehele ‘trips’-functionaliteit. Daarbij pakte Rocco een ander deel van de issues over die eigenlijk waren voor een ander teamgenoot. Helaas door ziekte kon dit teamgenoot niet meedoen in het project.</w:t>
       </w:r>
     </w:p>
     <w:p>
@@ -22203,19 +22128,6 @@
         <w:t xml:space="preserve">Reflectie</w:t>
       </w:r>
       <w:bookmarkEnd w:id="37"/>
-    </w:p>
-    <w:p>
-      <w:pPr>
-        <w:spacing w:after="120"/>
-      </w:pPr>
-      <w:r>
-        <w:rPr>
-          <w:i/>
-          <w:iCs/>
-          <w:highlight w:val="yellow"/>
-        </w:rPr>
-        <w:t xml:space="preserve">[Concept op basis van de code, de tests en de repo. Pas het aan naar jullie eigen ervaring.]</w:t>
-      </w:r>
     </w:p>
     <w:p>
       <w:pPr>

</xml_diff>